<commit_message>
Fiche socio : compléments textes 5 et 6
Co-Authored-By: Claude Opus 5.5 <noreply@anthropic.com>
Claude-Session: https://claude.ai/code/session_01QpWqLE6JcMzz1niJKAULZf
</commit_message>
<xml_diff>
--- a/fiches/Socio_Institutions_fiche.docx
+++ b/fiches/Socio_Institutions_fiche.docx
@@ -4477,7 +4477,30 @@
               <w:spacing w:after="30"/>
             </w:pPr>
             <w:r>
-              <w:t xml:space="preserve">Ils jugent la médecine populaire avec </w:t>
+              <w:t xml:space="preserve">Ils classent leurs concurrents selon la </w:t>
+            </w:r>
+            <w:r>
+              <w:rPr>
+                <w:b/>
+                <w:bCs/>
+              </w:rPr>
+              <w:t xml:space="preserve">fonction médicale</w:t>
+            </w:r>
+            <w:r>
+              <w:t xml:space="preserve"> qu'ils leur attribuent : au pharmacien correspond le vendeur de drogues, au médecin le guérisseur, etc.</w:t>
+            </w:r>
+          </w:p>
+          <w:p>
+            <w:pPr>
+              <w:pStyle w:val="ListParagraph"/>
+              <w:numPr>
+                <w:ilvl w:val="0"/>
+                <w:numId w:val="2"/>
+              </w:numPr>
+              <w:spacing w:after="30"/>
+            </w:pPr>
+            <w:r>
+              <w:t xml:space="preserve">Ils « transposent dans la médecine populaire une grille et des critères qui appartiennent à la médecine savante » → jugement avec </w:t>
             </w:r>
             <w:r>
               <w:rPr>
@@ -4487,7 +4510,7 @@
               <w:t xml:space="preserve">leurs propres critères</w:t>
             </w:r>
             <w:r>
-              <w:t xml:space="preserve"> de la « bonne médecine » = </w:t>
+              <w:t xml:space="preserve"> = </w:t>
             </w:r>
             <w:r>
               <w:rPr>
@@ -4517,6 +4540,162 @@
             </w:r>
             <w:r>
               <w:t xml:space="preserve"> (fréquent dans les luttes institutionnelles)</w:t>
+            </w:r>
+          </w:p>
+        </w:tc>
+      </w:tr>
+      <w:tr>
+        <w:trPr>
+          <w:cantSplit/>
+        </w:trPr>
+        <w:tc>
+          <w:tcPr>
+            <w:tcW w:type="dxa" w:w="2100"/>
+            <w:tcBorders>
+              <w:top w:val="single" w:color="8C8C8C" w:sz="6"/>
+              <w:left w:val="single" w:color="8C8C8C" w:sz="6"/>
+              <w:bottom w:val="single" w:color="8C8C8C" w:sz="6"/>
+              <w:right w:val="single" w:color="8C8C8C" w:sz="6"/>
+            </w:tcBorders>
+            <w:shd w:fill="E0F0DC" w:color="auto" w:val="clear"/>
+            <w:tcMar>
+              <w:top w:type="dxa" w:w="50"/>
+              <w:left w:type="dxa" w:w="90"/>
+              <w:bottom w:type="dxa" w:w="50"/>
+              <w:right w:type="dxa" w:w="90"/>
+            </w:tcMar>
+            <w:vAlign w:val="center"/>
+          </w:tcPr>
+          <w:p>
+            <w:pPr>
+              <w:jc w:val="center"/>
+            </w:pPr>
+            <w:r>
+              <w:rPr>
+                <w:b/>
+                <w:bCs/>
+                <w:sz w:val="18"/>
+                <w:szCs w:val="18"/>
+              </w:rPr>
+              <w:t xml:space="preserve">Conclusion</w:t>
+            </w:r>
+          </w:p>
+          <w:p>
+            <w:pPr>
+              <w:jc w:val="center"/>
+            </w:pPr>
+            <w:r>
+              <w:rPr>
+                <w:b/>
+                <w:bCs/>
+                <w:sz w:val="18"/>
+                <w:szCs w:val="18"/>
+              </w:rPr>
+              <w:t xml:space="preserve">du texte</w:t>
+            </w:r>
+          </w:p>
+        </w:tc>
+        <w:tc>
+          <w:tcPr>
+            <w:tcW w:type="dxa" w:w="8366"/>
+            <w:tcBorders>
+              <w:top w:val="single" w:color="8C8C8C" w:sz="6"/>
+              <w:left w:val="single" w:color="8C8C8C" w:sz="6"/>
+              <w:bottom w:val="single" w:color="8C8C8C" w:sz="6"/>
+              <w:right w:val="single" w:color="8C8C8C" w:sz="6"/>
+            </w:tcBorders>
+            <w:tcMar>
+              <w:top w:type="dxa" w:w="50"/>
+              <w:left w:type="dxa" w:w="90"/>
+              <w:bottom w:type="dxa" w:w="50"/>
+              <w:right w:type="dxa" w:w="90"/>
+            </w:tcMar>
+            <w:vAlign w:val="center"/>
+          </w:tcPr>
+          <w:p>
+            <w:pPr>
+              <w:pStyle w:val="ListParagraph"/>
+              <w:numPr>
+                <w:ilvl w:val="0"/>
+                <w:numId w:val="2"/>
+              </w:numPr>
+              <w:spacing w:after="30"/>
+            </w:pPr>
+            <w:r>
+              <w:t xml:space="preserve">Une </w:t>
+            </w:r>
+            <w:r>
+              <w:rPr>
+                <w:b/>
+                <w:bCs/>
+              </w:rPr>
+              <w:t xml:space="preserve">attitude de conquérant</w:t>
+            </w:r>
+            <w:r>
+              <w:t xml:space="preserve"> : une « croisade » contre le charlatanisme aux XIXe-XXe siècles = </w:t>
+            </w:r>
+            <w:r>
+              <w:rPr>
+                <w:b/>
+                <w:bCs/>
+              </w:rPr>
+              <w:t xml:space="preserve">médicalisation</w:t>
+            </w:r>
+            <w:r>
+              <w:t xml:space="preserve"> de la société</w:t>
+            </w:r>
+          </w:p>
+          <w:p>
+            <w:pPr>
+              <w:pStyle w:val="ListParagraph"/>
+              <w:numPr>
+                <w:ilvl w:val="0"/>
+                <w:numId w:val="2"/>
+              </w:numPr>
+              <w:spacing w:after="30"/>
+            </w:pPr>
+            <w:r>
+              <w:t xml:space="preserve">Un groupe </w:t>
+            </w:r>
+            <w:r>
+              <w:rPr>
+                <w:b/>
+                <w:bCs/>
+              </w:rPr>
+              <w:t xml:space="preserve">masculin</w:t>
+            </w:r>
+            <w:r>
+              <w:t xml:space="preserve"> qui se dit supérieur → exclusion des femmes (sages-femmes, « sorcières »)</w:t>
+            </w:r>
+          </w:p>
+          <w:p>
+            <w:pPr>
+              <w:pStyle w:val="ListParagraph"/>
+              <w:numPr>
+                <w:ilvl w:val="0"/>
+                <w:numId w:val="2"/>
+              </w:numPr>
+              <w:spacing w:after="30"/>
+            </w:pPr>
+            <w:r>
+              <w:t xml:space="preserve">Le </w:t>
+            </w:r>
+            <w:r>
+              <w:rPr>
+                <w:b/>
+                <w:bCs/>
+              </w:rPr>
+              <w:t xml:space="preserve">sentiment de supériorité</w:t>
+            </w:r>
+            <w:r>
+              <w:t xml:space="preserve"> des médecins sur les « charlatans » existe </w:t>
+            </w:r>
+            <w:r>
+              <w:rPr>
+                <w:b/>
+                <w:bCs/>
+              </w:rPr>
+              <w:t xml:space="preserve">encore aujourd'hui</w:t>
             </w:r>
           </w:p>
         </w:tc>
@@ -5041,7 +5220,17 @@
               <w:t xml:space="preserve">SPHÈRE AUTONOME</w:t>
             </w:r>
             <w:r>
-              <w:t xml:space="preserve"> : exister en soi</w:t>
+              <w:t xml:space="preserve"> : exister en soi, se </w:t>
+            </w:r>
+            <w:r>
+              <w:rPr>
+                <w:b/>
+                <w:bCs/>
+              </w:rPr>
+              <w:t xml:space="preserve">détacher</w:t>
+            </w:r>
+            <w:r>
+              <w:t xml:space="preserve"> des pratiques libres</w:t>
             </w:r>
           </w:p>
           <w:p>
@@ -5073,6 +5262,29 @@
             </w:r>
             <w:r>
               <w:t xml:space="preserve"> (PASS, numerus clausus, doctorat, élection…)</w:t>
+            </w:r>
+          </w:p>
+          <w:p>
+            <w:pPr>
+              <w:spacing w:after="40"/>
+            </w:pPr>
+            <w:r>
+              <w:rPr>
+                <w:i/>
+                <w:iCs/>
+              </w:rPr>
+              <w:t xml:space="preserve">Phrase clé de Hubscher :</w:t>
+            </w:r>
+            <w:r>
+              <w:t xml:space="preserve"> </w:t>
+            </w:r>
+            <w:r>
+              <w:rPr>
+                <w:b/>
+                <w:bCs/>
+                <w:shd w:fill="FCEFB4" w:color="auto" w:val="clear"/>
+              </w:rPr>
+              <w:t xml:space="preserve">« De pratiques non codifiées, exercées librement, se détache une sphère autonome dont l'accès réglementé réserve à ses membres une appellation contrôlée ; s'engage alors une lutte entre ceux qui veulent s'arroger le monopole et ceux qui le leur dénient. Ce travail de légitimation vise la reconnaissance sociale et institutionnelle. »</w:t>
             </w:r>
           </w:p>
         </w:tc>
@@ -5428,44 +5640,113 @@
               <w:spacing w:after="30"/>
             </w:pPr>
             <w:r>
+              <w:t xml:space="preserve">Au début du XIXe : élèves </w:t>
+            </w:r>
+            <w:r>
+              <w:rPr>
+                <w:b/>
+                <w:bCs/>
+              </w:rPr>
+              <w:t xml:space="preserve">peu instruits</w:t>
+            </w:r>
+            <w:r>
+              <w:t xml:space="preserve">, d'origine modeste → métier dévalorisé</w:t>
+            </w:r>
+          </w:p>
+          <w:p>
+            <w:pPr>
+              <w:pStyle w:val="ListParagraph"/>
+              <w:numPr>
+                <w:ilvl w:val="0"/>
+                <w:numId w:val="2"/>
+              </w:numPr>
+              <w:spacing w:after="30"/>
+            </w:pPr>
+            <w:r>
+              <w:t xml:space="preserve">On durcit l'examen d'entrée (classes préparatoires) puis on rend le </w:t>
+            </w:r>
+            <w:r>
+              <w:rPr>
+                <w:b/>
+                <w:bCs/>
+                <w:shd w:fill="FBDDBE" w:color="auto" w:val="clear"/>
+              </w:rPr>
+              <w:t xml:space="preserve">bac obligatoire en 1890</w:t>
+            </w:r>
+          </w:p>
+          <w:p>
+            <w:pPr>
+              <w:pStyle w:val="ListParagraph"/>
+              <w:numPr>
+                <w:ilvl w:val="0"/>
+                <w:numId w:val="2"/>
+              </w:numPr>
+              <w:spacing w:after="30"/>
+            </w:pPr>
+            <w:r>
+              <w:t xml:space="preserve">→ acquérir un </w:t>
+            </w:r>
+            <w:r>
+              <w:rPr>
+                <w:b/>
+                <w:bCs/>
+                <w:shd w:fill="E4D9F0" w:color="auto" w:val="clear"/>
+              </w:rPr>
+              <w:t xml:space="preserve">capital culturel</w:t>
+            </w:r>
+            <w:r>
+              <w:t xml:space="preserve">, </w:t>
+            </w:r>
+            <w:r>
+              <w:rPr>
+                <w:b/>
+                <w:bCs/>
+              </w:rPr>
+              <w:t xml:space="preserve">rompre avec les maréchaux et les empiriques</w:t>
+            </w:r>
+            <w:r>
+              <w:t xml:space="preserve">, recruter dans la </w:t>
+            </w:r>
+            <w:r>
+              <w:rPr>
+                <w:b/>
+                <w:bCs/>
+              </w:rPr>
+              <w:t xml:space="preserve">bourgeoisie</w:t>
+            </w:r>
+            <w:r>
+              <w:t xml:space="preserve">, gagner </w:t>
+            </w:r>
+            <w:r>
+              <w:rPr>
+                <w:b/>
+                <w:bCs/>
+              </w:rPr>
+              <w:t xml:space="preserve">prestige</w:t>
+            </w:r>
+            <w:r>
+              <w:t xml:space="preserve"> et « lettres de noblesse »</w:t>
+            </w:r>
+          </w:p>
+          <w:p>
+            <w:pPr>
+              <w:pStyle w:val="ListParagraph"/>
+              <w:numPr>
+                <w:ilvl w:val="0"/>
+                <w:numId w:val="2"/>
+              </w:numPr>
+              <w:spacing w:after="30"/>
+            </w:pPr>
+            <w:r>
               <w:t xml:space="preserve">→ </w:t>
             </w:r>
             <w:r>
               <w:rPr>
                 <w:b/>
                 <w:bCs/>
-              </w:rPr>
-              <w:t xml:space="preserve">contrôler l'accès</w:t>
-            </w:r>
-            <w:r>
-              <w:t xml:space="preserve"> à la profession, se </w:t>
-            </w:r>
-            <w:r>
-              <w:rPr>
-                <w:b/>
-                <w:bCs/>
-              </w:rPr>
-              <w:t xml:space="preserve">distinguer des empiriques</w:t>
-            </w:r>
-            <w:r>
-              <w:t xml:space="preserve">, gagner </w:t>
-            </w:r>
-            <w:r>
-              <w:rPr>
-                <w:b/>
-                <w:bCs/>
-              </w:rPr>
-              <w:t xml:space="preserve">prestige</w:t>
-            </w:r>
-            <w:r>
-              <w:t xml:space="preserve"> et </w:t>
-            </w:r>
-            <w:r>
-              <w:rPr>
-                <w:b/>
-                <w:bCs/>
-              </w:rPr>
-              <w:t xml:space="preserve">légitimité</w:t>
+                <w:shd w:fill="F7CFCF" w:color="auto" w:val="clear"/>
+              </w:rPr>
+              <w:t xml:space="preserve">contrôler l'accès = créer une sphère autonome coupée des empiriques</w:t>
             </w:r>
           </w:p>
         </w:tc>
@@ -5593,6 +5874,59 @@
               <w:spacing w:after="30"/>
             </w:pPr>
             <w:r>
+              <w:t xml:space="preserve">Les écoles prennent pour </w:t>
+            </w:r>
+            <w:r>
+              <w:rPr>
+                <w:b/>
+                <w:bCs/>
+              </w:rPr>
+              <w:t xml:space="preserve">modèle la médecine</w:t>
+            </w:r>
+            <w:r>
+              <w:t xml:space="preserve"> (chaires spécialisées, physiologie, bactériologie) ; savants vétérinaires : </w:t>
+            </w:r>
+            <w:r>
+              <w:rPr>
+                <w:b/>
+                <w:bCs/>
+                <w:shd w:fill="D4EBCB" w:color="auto" w:val="clear"/>
+              </w:rPr>
+              <w:t xml:space="preserve">Chauveau</w:t>
+            </w:r>
+            <w:r>
+              <w:t xml:space="preserve">, </w:t>
+            </w:r>
+            <w:r>
+              <w:rPr>
+                <w:b/>
+                <w:bCs/>
+                <w:shd w:fill="D4EBCB" w:color="auto" w:val="clear"/>
+              </w:rPr>
+              <w:t xml:space="preserve">Galtier</w:t>
+            </w:r>
+            <w:r>
+              <w:t xml:space="preserve">, </w:t>
+            </w:r>
+            <w:r>
+              <w:rPr>
+                <w:b/>
+                <w:bCs/>
+                <w:shd w:fill="D4EBCB" w:color="auto" w:val="clear"/>
+              </w:rPr>
+              <w:t xml:space="preserve">Toussaint</w:t>
+            </w:r>
+          </w:p>
+          <w:p>
+            <w:pPr>
+              <w:pStyle w:val="ListParagraph"/>
+              <w:numPr>
+                <w:ilvl w:val="0"/>
+                <w:numId w:val="2"/>
+              </w:numPr>
+              <w:spacing w:after="30"/>
+            </w:pPr>
+            <w:r>
               <w:t xml:space="preserve">Comment : </w:t>
             </w:r>
             <w:r>
@@ -5614,7 +5948,39 @@
               <w:t xml:space="preserve">médecine</w:t>
             </w:r>
             <w:r>
-              <w:t xml:space="preserve"> (ex : Pasteur a besoin des animaux pour ses recherches) ; pas aux disciplines fragiles</w:t>
+              <w:t xml:space="preserve"> → « Sainte Alliance » avec </w:t>
+            </w:r>
+            <w:r>
+              <w:rPr>
+                <w:b/>
+                <w:bCs/>
+              </w:rPr>
+              <w:t xml:space="preserve">Pasteur</w:t>
+            </w:r>
+            <w:r>
+              <w:t xml:space="preserve"> (</w:t>
+            </w:r>
+            <w:r>
+              <w:rPr>
+                <w:b/>
+                <w:bCs/>
+                <w:shd w:fill="D4EBCB" w:color="auto" w:val="clear"/>
+              </w:rPr>
+              <w:t xml:space="preserve">Henry Bouley</w:t>
+            </w:r>
+            <w:r>
+              <w:t xml:space="preserve">) : les vétos fournissent les animaux pour ses expériences (vaccin du charbon, </w:t>
+            </w:r>
+            <w:r>
+              <w:rPr>
+                <w:b/>
+                <w:bCs/>
+                <w:shd w:fill="FBDDBE" w:color="auto" w:val="clear"/>
+              </w:rPr>
+              <w:t xml:space="preserve">1881</w:t>
+            </w:r>
+            <w:r>
+              <w:t xml:space="preserve">) ; pas aux disciplines fragiles</w:t>
             </w:r>
           </w:p>
           <w:p>
@@ -5847,6 +6213,27 @@
               <w:t xml:space="preserve">1923</w:t>
             </w:r>
             <w:r>
+              <w:t xml:space="preserve"> puis au </w:t>
+            </w:r>
+            <w:r>
+              <w:rPr>
+                <w:b/>
+                <w:bCs/>
+              </w:rPr>
+              <w:t xml:space="preserve">monopole</w:t>
+            </w:r>
+            <w:r>
+              <w:t xml:space="preserve"> réservé aux diplômés en </w:t>
+            </w:r>
+            <w:r>
+              <w:rPr>
+                <w:b/>
+                <w:bCs/>
+                <w:shd w:fill="FBDDBE" w:color="auto" w:val="clear"/>
+              </w:rPr>
+              <w:t xml:space="preserve">1938</w:t>
+            </w:r>
+            <w:r>
               <w:t xml:space="preserve"> = </w:t>
             </w:r>
             <w:r>
@@ -5854,7 +6241,7 @@
                 <w:b/>
                 <w:bCs/>
               </w:rPr>
-              <w:t xml:space="preserve">acte officiel</w:t>
+              <w:t xml:space="preserve">actes officiels</w:t>
             </w:r>
             <w:r>
               <w:t xml:space="preserve"> (≠ processus, cf. principe ②)</w:t>
@@ -6006,7 +6393,7 @@
               <w:t xml:space="preserve">entrepreneurs de cause</w:t>
             </w:r>
             <w:r>
-              <w:t xml:space="preserve"> (ex : Chauveau, H. Bouley)</w:t>
+              <w:t xml:space="preserve"> (ex : Chauveau, Henry Bouley)</w:t>
             </w:r>
           </w:p>
         </w:tc>

</xml_diff>

<commit_message>
Fiche socio : ajout du début du cours (1.2 fonctions/place/relations, Durkheim, tableau texte 2)
Co-Authored-By: Claude Opus 5.5 <noreply@anthropic.com>
Claude-Session: https://claude.ai/code/session_01VtpUHsd8wU3yZgx1iWS1Pw
</commit_message>
<xml_diff>
--- a/fiches/Socio_Institutions_fiche.docx
+++ b/fiches/Socio_Institutions_fiche.docx
@@ -629,6 +629,93 @@
               <w:spacing w:after="30"/>
             </w:pPr>
             <w:r>
+              <w:t xml:space="preserve">Dans une société, une institution = un </w:t>
+            </w:r>
+            <w:r>
+              <w:rPr>
+                <w:b/>
+                <w:bCs/>
+                <w:shd w:fill="FCEFB4" w:color="auto" w:val="clear"/>
+              </w:rPr>
+              <w:t xml:space="preserve">dispositif plus ou moins organisé visant au bon fonctionnement de la vie collective</w:t>
+            </w:r>
+            <w:r>
+              <w:t xml:space="preserve"> : elle englobe des </w:t>
+            </w:r>
+            <w:r>
+              <w:rPr>
+                <w:b/>
+                <w:bCs/>
+              </w:rPr>
+              <w:t xml:space="preserve">normes, règles et sanctions</w:t>
+            </w:r>
+            <w:r>
+              <w:t xml:space="preserve"> qui définissent les </w:t>
+            </w:r>
+            <w:r>
+              <w:rPr>
+                <w:b/>
+                <w:bCs/>
+              </w:rPr>
+              <w:t xml:space="preserve">rôles</w:t>
+            </w:r>
+            <w:r>
+              <w:t xml:space="preserve"> des individus membres</w:t>
+            </w:r>
+          </w:p>
+          <w:p>
+            <w:pPr>
+              <w:pStyle w:val="ListParagraph"/>
+              <w:numPr>
+                <w:ilvl w:val="0"/>
+                <w:numId w:val="2"/>
+              </w:numPr>
+              <w:spacing w:after="30"/>
+            </w:pPr>
+            <w:r>
+              <w:t xml:space="preserve">La sociologie cherche à comprendre le </w:t>
+            </w:r>
+            <w:r>
+              <w:rPr>
+                <w:b/>
+                <w:bCs/>
+              </w:rPr>
+              <w:t xml:space="preserve">phénomène institutionnel</w:t>
+            </w:r>
+            <w:r>
+              <w:t xml:space="preserve"> : comment les individus </w:t>
+            </w:r>
+            <w:r>
+              <w:rPr>
+                <w:b/>
+                <w:bCs/>
+              </w:rPr>
+              <w:t xml:space="preserve">agissent</w:t>
+            </w:r>
+            <w:r>
+              <w:t xml:space="preserve"> ou </w:t>
+            </w:r>
+            <w:r>
+              <w:rPr>
+                <w:b/>
+                <w:bCs/>
+              </w:rPr>
+              <w:t xml:space="preserve">sont agis</w:t>
+            </w:r>
+            <w:r>
+              <w:t xml:space="preserve"> par les institutions</w:t>
+            </w:r>
+          </w:p>
+          <w:p>
+            <w:pPr>
+              <w:pStyle w:val="ListParagraph"/>
+              <w:numPr>
+                <w:ilvl w:val="0"/>
+                <w:numId w:val="2"/>
+              </w:numPr>
+              <w:spacing w:after="30"/>
+            </w:pPr>
+            <w:r>
               <w:t xml:space="preserve">Institution = </w:t>
             </w:r>
             <w:r>
@@ -943,7 +1030,7 @@
                 <w:sz w:val="21"/>
                 <w:szCs w:val="21"/>
               </w:rPr>
-              <w:t xml:space="preserve">1.2 — LES INSTITUTIONS DANS LA SOCIÉTÉ</w:t>
+              <w:t xml:space="preserve">1.2 — LA PLACE DES INSTITUTIONS DANS LA SOCIÉTÉ</w:t>
             </w:r>
           </w:p>
         </w:tc>
@@ -981,7 +1068,474 @@
                 <w:sz w:val="18"/>
                 <w:szCs w:val="18"/>
               </w:rPr>
-              <w:t xml:space="preserve">Caractéristiques</w:t>
+              <w:t xml:space="preserve">A) Fonctions</w:t>
+            </w:r>
+          </w:p>
+        </w:tc>
+        <w:tc>
+          <w:tcPr>
+            <w:tcW w:type="dxa" w:w="8366"/>
+            <w:tcBorders>
+              <w:top w:val="single" w:color="8C8C8C" w:sz="6"/>
+              <w:left w:val="single" w:color="8C8C8C" w:sz="6"/>
+              <w:bottom w:val="single" w:color="8C8C8C" w:sz="6"/>
+              <w:right w:val="single" w:color="8C8C8C" w:sz="6"/>
+            </w:tcBorders>
+            <w:tcMar>
+              <w:top w:type="dxa" w:w="50"/>
+              <w:left w:type="dxa" w:w="90"/>
+              <w:bottom w:type="dxa" w:w="50"/>
+              <w:right w:type="dxa" w:w="90"/>
+            </w:tcMar>
+            <w:vAlign w:val="center"/>
+          </w:tcPr>
+          <w:p>
+            <w:pPr>
+              <w:pStyle w:val="ListParagraph"/>
+              <w:numPr>
+                <w:ilvl w:val="0"/>
+                <w:numId w:val="2"/>
+              </w:numPr>
+              <w:spacing w:after="30"/>
+            </w:pPr>
+            <w:r>
+              <w:t xml:space="preserve">① </w:t>
+            </w:r>
+            <w:r>
+              <w:rPr>
+                <w:b/>
+                <w:bCs/>
+                <w:shd w:fill="F7CFCF" w:color="auto" w:val="clear"/>
+              </w:rPr>
+              <w:t xml:space="preserve">Régulation, ordonnancement et intégration sociale</w:t>
+            </w:r>
+            <w:r>
+              <w:t xml:space="preserve"> : les relations entre individus passent par les institutions → elles </w:t>
+            </w:r>
+            <w:r>
+              <w:rPr>
+                <w:b/>
+                <w:bCs/>
+              </w:rPr>
+              <w:t xml:space="preserve">construisent et transmettent le vivre ensemble</w:t>
+            </w:r>
+          </w:p>
+          <w:p>
+            <w:pPr>
+              <w:pStyle w:val="ListParagraph"/>
+              <w:numPr>
+                <w:ilvl w:val="0"/>
+                <w:numId w:val="2"/>
+              </w:numPr>
+              <w:spacing w:after="30"/>
+            </w:pPr>
+            <w:r>
+              <w:t xml:space="preserve">Les individus « normés » sont acceptés dans l'institution = </w:t>
+            </w:r>
+            <w:r>
+              <w:rPr>
+                <w:b/>
+                <w:bCs/>
+                <w:shd w:fill="E4D9F0" w:color="auto" w:val="clear"/>
+              </w:rPr>
+              <w:t xml:space="preserve">principe d'intégration</w:t>
+            </w:r>
+            <w:r>
+              <w:t xml:space="preserve"> (≠ principe d'exclusion)</w:t>
+            </w:r>
+          </w:p>
+          <w:p>
+            <w:pPr>
+              <w:pStyle w:val="ListParagraph"/>
+              <w:numPr>
+                <w:ilvl w:val="0"/>
+                <w:numId w:val="2"/>
+              </w:numPr>
+              <w:spacing w:after="30"/>
+            </w:pPr>
+            <w:r>
+              <w:t xml:space="preserve">② </w:t>
+            </w:r>
+            <w:r>
+              <w:rPr>
+                <w:b/>
+                <w:bCs/>
+                <w:shd w:fill="F7CFCF" w:color="auto" w:val="clear"/>
+              </w:rPr>
+              <w:t xml:space="preserve">Classification et hiérarchisation</w:t>
+            </w:r>
+            <w:r>
+              <w:t xml:space="preserve"> : elles </w:t>
+            </w:r>
+            <w:r>
+              <w:rPr>
+                <w:b/>
+                <w:bCs/>
+              </w:rPr>
+              <w:t xml:space="preserve">classent</w:t>
+            </w:r>
+            <w:r>
+              <w:t xml:space="preserve"> les individus entre eux et </w:t>
+            </w:r>
+            <w:r>
+              <w:rPr>
+                <w:b/>
+                <w:bCs/>
+              </w:rPr>
+              <w:t xml:space="preserve">créent la hiérarchie</w:t>
+            </w:r>
+          </w:p>
+        </w:tc>
+      </w:tr>
+      <w:tr>
+        <w:trPr>
+          <w:cantSplit/>
+        </w:trPr>
+        <w:tc>
+          <w:tcPr>
+            <w:tcW w:type="dxa" w:w="2100"/>
+            <w:tcBorders>
+              <w:top w:val="single" w:color="8C8C8C" w:sz="6"/>
+              <w:left w:val="single" w:color="8C8C8C" w:sz="6"/>
+              <w:bottom w:val="single" w:color="8C8C8C" w:sz="6"/>
+              <w:right w:val="single" w:color="8C8C8C" w:sz="6"/>
+            </w:tcBorders>
+            <w:shd w:fill="DCEAF7" w:color="auto" w:val="clear"/>
+            <w:tcMar>
+              <w:top w:type="dxa" w:w="50"/>
+              <w:left w:type="dxa" w:w="90"/>
+              <w:bottom w:type="dxa" w:w="50"/>
+              <w:right w:type="dxa" w:w="90"/>
+            </w:tcMar>
+            <w:vAlign w:val="center"/>
+          </w:tcPr>
+          <w:p>
+            <w:pPr>
+              <w:jc w:val="center"/>
+            </w:pPr>
+            <w:r>
+              <w:rPr>
+                <w:b/>
+                <w:bCs/>
+                <w:sz w:val="18"/>
+                <w:szCs w:val="18"/>
+              </w:rPr>
+              <w:t xml:space="preserve">B) Place</w:t>
+            </w:r>
+          </w:p>
+        </w:tc>
+        <w:tc>
+          <w:tcPr>
+            <w:tcW w:type="dxa" w:w="8366"/>
+            <w:tcBorders>
+              <w:top w:val="single" w:color="8C8C8C" w:sz="6"/>
+              <w:left w:val="single" w:color="8C8C8C" w:sz="6"/>
+              <w:bottom w:val="single" w:color="8C8C8C" w:sz="6"/>
+              <w:right w:val="single" w:color="8C8C8C" w:sz="6"/>
+            </w:tcBorders>
+            <w:tcMar>
+              <w:top w:type="dxa" w:w="50"/>
+              <w:left w:type="dxa" w:w="90"/>
+              <w:bottom w:type="dxa" w:w="50"/>
+              <w:right w:type="dxa" w:w="90"/>
+            </w:tcMar>
+            <w:vAlign w:val="center"/>
+          </w:tcPr>
+          <w:p>
+            <w:pPr>
+              <w:pStyle w:val="ListParagraph"/>
+              <w:numPr>
+                <w:ilvl w:val="0"/>
+                <w:numId w:val="2"/>
+              </w:numPr>
+              <w:spacing w:after="30"/>
+            </w:pPr>
+            <w:r>
+              <w:t xml:space="preserve">Place </w:t>
+            </w:r>
+            <w:r>
+              <w:rPr>
+                <w:b/>
+                <w:bCs/>
+                <w:shd w:fill="F7CFCF" w:color="auto" w:val="clear"/>
+              </w:rPr>
+              <w:t xml:space="preserve">centrale</w:t>
+            </w:r>
+            <w:r>
+              <w:t xml:space="preserve"> : </w:t>
+            </w:r>
+            <w:r>
+              <w:rPr>
+                <w:b/>
+                <w:bCs/>
+              </w:rPr>
+              <w:t xml:space="preserve">sans institution, il n'y a pas de société</w:t>
+            </w:r>
+            <w:r>
+              <w:t xml:space="preserve"> ; elles sont déterminantes dans la société</w:t>
+            </w:r>
+          </w:p>
+          <w:p>
+            <w:pPr>
+              <w:pStyle w:val="ListParagraph"/>
+              <w:numPr>
+                <w:ilvl w:val="0"/>
+                <w:numId w:val="2"/>
+              </w:numPr>
+              <w:spacing w:after="30"/>
+            </w:pPr>
+            <w:r>
+              <w:t xml:space="preserve">→ une société = un </w:t>
+            </w:r>
+            <w:r>
+              <w:rPr>
+                <w:b/>
+                <w:bCs/>
+              </w:rPr>
+              <w:t xml:space="preserve">ensemble d'institutions</w:t>
+            </w:r>
+          </w:p>
+        </w:tc>
+      </w:tr>
+      <w:tr>
+        <w:trPr>
+          <w:cantSplit/>
+        </w:trPr>
+        <w:tc>
+          <w:tcPr>
+            <w:tcW w:type="dxa" w:w="2100"/>
+            <w:tcBorders>
+              <w:top w:val="single" w:color="8C8C8C" w:sz="6"/>
+              <w:left w:val="single" w:color="8C8C8C" w:sz="6"/>
+              <w:bottom w:val="single" w:color="8C8C8C" w:sz="6"/>
+              <w:right w:val="single" w:color="8C8C8C" w:sz="6"/>
+            </w:tcBorders>
+            <w:shd w:fill="DCEAF7" w:color="auto" w:val="clear"/>
+            <w:tcMar>
+              <w:top w:type="dxa" w:w="50"/>
+              <w:left w:type="dxa" w:w="90"/>
+              <w:bottom w:type="dxa" w:w="50"/>
+              <w:right w:type="dxa" w:w="90"/>
+            </w:tcMar>
+            <w:vAlign w:val="center"/>
+          </w:tcPr>
+          <w:p>
+            <w:pPr>
+              <w:jc w:val="center"/>
+            </w:pPr>
+            <w:r>
+              <w:rPr>
+                <w:b/>
+                <w:bCs/>
+                <w:sz w:val="18"/>
+                <w:szCs w:val="18"/>
+              </w:rPr>
+              <w:t xml:space="preserve">C) Relations</w:t>
+            </w:r>
+          </w:p>
+          <w:p>
+            <w:pPr>
+              <w:jc w:val="center"/>
+            </w:pPr>
+            <w:r>
+              <w:rPr>
+                <w:b/>
+                <w:bCs/>
+                <w:sz w:val="18"/>
+                <w:szCs w:val="18"/>
+              </w:rPr>
+              <w:t xml:space="preserve">inter-</w:t>
+            </w:r>
+          </w:p>
+          <w:p>
+            <w:pPr>
+              <w:jc w:val="center"/>
+            </w:pPr>
+            <w:r>
+              <w:rPr>
+                <w:b/>
+                <w:bCs/>
+                <w:sz w:val="18"/>
+                <w:szCs w:val="18"/>
+              </w:rPr>
+              <w:t xml:space="preserve">institutionnelles</w:t>
+            </w:r>
+          </w:p>
+        </w:tc>
+        <w:tc>
+          <w:tcPr>
+            <w:tcW w:type="dxa" w:w="8366"/>
+            <w:tcBorders>
+              <w:top w:val="single" w:color="8C8C8C" w:sz="6"/>
+              <w:left w:val="single" w:color="8C8C8C" w:sz="6"/>
+              <w:bottom w:val="single" w:color="8C8C8C" w:sz="6"/>
+              <w:right w:val="single" w:color="8C8C8C" w:sz="6"/>
+            </w:tcBorders>
+            <w:tcMar>
+              <w:top w:type="dxa" w:w="50"/>
+              <w:left w:type="dxa" w:w="90"/>
+              <w:bottom w:type="dxa" w:w="50"/>
+              <w:right w:type="dxa" w:w="90"/>
+            </w:tcMar>
+            <w:vAlign w:val="center"/>
+          </w:tcPr>
+          <w:p>
+            <w:pPr>
+              <w:pStyle w:val="ListParagraph"/>
+              <w:numPr>
+                <w:ilvl w:val="0"/>
+                <w:numId w:val="2"/>
+              </w:numPr>
+              <w:spacing w:after="30"/>
+            </w:pPr>
+            <w:r>
+              <w:t xml:space="preserve">Aucune institution n'est totalement autonome : elles ne vivent pas pour et par elles-mêmes, elles sont </w:t>
+            </w:r>
+            <w:r>
+              <w:rPr>
+                <w:b/>
+                <w:bCs/>
+              </w:rPr>
+              <w:t xml:space="preserve">toujours en relation avec d'autres</w:t>
+            </w:r>
+          </w:p>
+          <w:p>
+            <w:pPr>
+              <w:pStyle w:val="ListParagraph"/>
+              <w:numPr>
+                <w:ilvl w:val="0"/>
+                <w:numId w:val="2"/>
+              </w:numPr>
+              <w:spacing w:after="30"/>
+            </w:pPr>
+            <w:r>
+              <w:t xml:space="preserve">Elles interfèrent entre elles et forment un </w:t>
+            </w:r>
+            <w:r>
+              <w:rPr>
+                <w:b/>
+                <w:bCs/>
+                <w:shd w:fill="E4D9F0" w:color="auto" w:val="clear"/>
+              </w:rPr>
+              <w:t xml:space="preserve">ordre institutionnel</w:t>
+            </w:r>
+            <w:r>
+              <w:t xml:space="preserve"> = </w:t>
+            </w:r>
+            <w:r>
+              <w:rPr>
+                <w:b/>
+                <w:bCs/>
+                <w:shd w:fill="F7CFCF" w:color="auto" w:val="clear"/>
+              </w:rPr>
+              <w:t xml:space="preserve">autonomie relative</w:t>
+            </w:r>
+            <w:r>
+              <w:t xml:space="preserve"> : une certaine marge de manœuvre, mais en lien avec les autres</w:t>
+            </w:r>
+          </w:p>
+          <w:p>
+            <w:pPr>
+              <w:pStyle w:val="ListParagraph"/>
+              <w:numPr>
+                <w:ilvl w:val="0"/>
+                <w:numId w:val="2"/>
+              </w:numPr>
+              <w:spacing w:after="30"/>
+            </w:pPr>
+            <w:r>
+              <w:t xml:space="preserve">Ex : la </w:t>
+            </w:r>
+            <w:r>
+              <w:rPr>
+                <w:b/>
+                <w:bCs/>
+              </w:rPr>
+              <w:t xml:space="preserve">famille</w:t>
+            </w:r>
+            <w:r>
+              <w:t xml:space="preserve"> qui éduque les enfants est en relation avec l'</w:t>
+            </w:r>
+            <w:r>
+              <w:rPr>
+                <w:b/>
+                <w:bCs/>
+              </w:rPr>
+              <w:t xml:space="preserve">école</w:t>
+            </w:r>
+            <w:r>
+              <w:t xml:space="preserve">, les institutions culturelles…</w:t>
+            </w:r>
+          </w:p>
+          <w:p>
+            <w:pPr>
+              <w:pStyle w:val="ListParagraph"/>
+              <w:numPr>
+                <w:ilvl w:val="0"/>
+                <w:numId w:val="2"/>
+              </w:numPr>
+              <w:spacing w:after="30"/>
+            </w:pPr>
+            <w:r>
+              <w:t xml:space="preserve">Selon sa nature, une institution a des </w:t>
+            </w:r>
+            <w:r>
+              <w:rPr>
+                <w:b/>
+                <w:bCs/>
+              </w:rPr>
+              <w:t xml:space="preserve">liens forts</w:t>
+            </w:r>
+            <w:r>
+              <w:t xml:space="preserve"> avec certaines institutions et </w:t>
+            </w:r>
+            <w:r>
+              <w:rPr>
+                <w:b/>
+                <w:bCs/>
+              </w:rPr>
+              <w:t xml:space="preserve">plus faibles</w:t>
+            </w:r>
+            <w:r>
+              <w:t xml:space="preserve"> avec d'autres</w:t>
+            </w:r>
+          </w:p>
+        </w:tc>
+      </w:tr>
+      <w:tr>
+        <w:trPr>
+          <w:cantSplit/>
+        </w:trPr>
+        <w:tc>
+          <w:tcPr>
+            <w:tcW w:type="dxa" w:w="2100"/>
+            <w:tcBorders>
+              <w:top w:val="single" w:color="8C8C8C" w:sz="6"/>
+              <w:left w:val="single" w:color="8C8C8C" w:sz="6"/>
+              <w:bottom w:val="single" w:color="8C8C8C" w:sz="6"/>
+              <w:right w:val="single" w:color="8C8C8C" w:sz="6"/>
+            </w:tcBorders>
+            <w:shd w:fill="DCEAF7" w:color="auto" w:val="clear"/>
+            <w:tcMar>
+              <w:top w:type="dxa" w:w="50"/>
+              <w:left w:type="dxa" w:w="90"/>
+              <w:bottom w:type="dxa" w:w="50"/>
+              <w:right w:type="dxa" w:w="90"/>
+            </w:tcMar>
+            <w:vAlign w:val="center"/>
+          </w:tcPr>
+          <w:p>
+            <w:pPr>
+              <w:jc w:val="center"/>
+            </w:pPr>
+            <w:r>
+              <w:rPr>
+                <w:b/>
+                <w:bCs/>
+                <w:sz w:val="18"/>
+                <w:szCs w:val="18"/>
+              </w:rPr>
+              <w:t xml:space="preserve">En résumé</w:t>
             </w:r>
           </w:p>
         </w:tc>
@@ -1172,7 +1726,7 @@
                 <w:sz w:val="18"/>
                 <w:szCs w:val="18"/>
               </w:rPr>
-              <w:t xml:space="preserve">Contexte</w:t>
+              <w:t xml:space="preserve">Idée générale</w:t>
             </w:r>
           </w:p>
         </w:tc>
@@ -1203,78 +1757,28 @@
               <w:spacing w:after="30"/>
             </w:pPr>
             <w:r>
-              <w:t xml:space="preserve">Fin XIXe : la sociologie s'</w:t>
-            </w:r>
-            <w:r>
-              <w:rPr>
-                <w:b/>
-                <w:bCs/>
-              </w:rPr>
-              <w:t xml:space="preserve">institutionnalise</w:t>
-            </w:r>
-            <w:r>
-              <w:t xml:space="preserve"> grâce à </w:t>
-            </w:r>
-            <w:r>
-              <w:rPr>
-                <w:b/>
-                <w:bCs/>
-                <w:shd w:fill="D4EBCB" w:color="auto" w:val="clear"/>
-              </w:rPr>
-              <w:t xml:space="preserve">Émile Durkheim</w:t>
-            </w:r>
-            <w:r>
-              <w:t xml:space="preserve"> → elle doit se distinguer des autres disciplines, surtout de la </w:t>
-            </w:r>
-            <w:r>
-              <w:rPr>
-                <w:b/>
-                <w:bCs/>
-              </w:rPr>
-              <w:t xml:space="preserve">psychologie</w:t>
-            </w:r>
-            <w:r>
-              <w:t xml:space="preserve"> (concurrent direct). 1er cours de socio : </w:t>
-            </w:r>
-            <w:r>
-              <w:rPr>
-                <w:b/>
-                <w:bCs/>
-                <w:shd w:fill="FBDDBE" w:color="auto" w:val="clear"/>
-              </w:rPr>
-              <w:t xml:space="preserve">1902</w:t>
-            </w:r>
-          </w:p>
-          <w:p>
-            <w:pPr>
-              <w:pStyle w:val="ListParagraph"/>
-              <w:numPr>
-                <w:ilvl w:val="0"/>
-                <w:numId w:val="2"/>
-              </w:numPr>
-              <w:spacing w:after="30"/>
-            </w:pPr>
-            <w:r>
-              <w:rPr>
-                <w:b/>
-                <w:bCs/>
-                <w:shd w:fill="D4EBCB" w:color="auto" w:val="clear"/>
-              </w:rPr>
-              <w:t xml:space="preserve">Marcel Mauss</w:t>
-            </w:r>
-            <w:r>
-              <w:t xml:space="preserve"> (1873-1950) = neveu de Durkheim, père fondateur de l'ethnologie ; </w:t>
-            </w:r>
-            <w:r>
-              <w:rPr>
-                <w:b/>
-                <w:bCs/>
-                <w:shd w:fill="D4EBCB" w:color="auto" w:val="clear"/>
-              </w:rPr>
-              <w:t xml:space="preserve">Paul Fauconnet</w:t>
-            </w:r>
-            <w:r>
-              <w:t xml:space="preserve"> (1874-1938)</w:t>
+              <w:t xml:space="preserve">Pour les Durkheimiens, la société a une </w:t>
+            </w:r>
+            <w:r>
+              <w:rPr>
+                <w:b/>
+                <w:bCs/>
+              </w:rPr>
+              <w:t xml:space="preserve">forte influence sur les individus</w:t>
+            </w:r>
+            <w:r>
+              <w:t xml:space="preserve"> → fort </w:t>
+            </w:r>
+            <w:r>
+              <w:rPr>
+                <w:b/>
+                <w:bCs/>
+                <w:shd w:fill="E4D9F0" w:color="auto" w:val="clear"/>
+              </w:rPr>
+              <w:t xml:space="preserve">déterminisme social</w:t>
+            </w:r>
+            <w:r>
+              <w:t xml:space="preserve">, notamment à cause des institutions qui affectent les individus</w:t>
             </w:r>
           </w:p>
         </w:tc>
@@ -1312,68 +1816,7 @@
                 <w:sz w:val="18"/>
                 <w:szCs w:val="18"/>
               </w:rPr>
-              <w:t xml:space="preserve">Texte 1</w:t>
-            </w:r>
-          </w:p>
-          <w:p>
-            <w:pPr>
-              <w:jc w:val="center"/>
-            </w:pPr>
-            <w:r>
-              <w:rPr>
-                <w:b/>
-                <w:bCs/>
-                <w:sz w:val="18"/>
-                <w:szCs w:val="18"/>
-              </w:rPr>
-              <w:t xml:space="preserve">Mauss &amp;</w:t>
-            </w:r>
-          </w:p>
-          <w:p>
-            <w:pPr>
-              <w:jc w:val="center"/>
-            </w:pPr>
-            <w:r>
-              <w:rPr>
-                <w:b/>
-                <w:bCs/>
-                <w:sz w:val="18"/>
-                <w:szCs w:val="18"/>
-              </w:rPr>
-              <w:t xml:space="preserve">Fauconnet</w:t>
-            </w:r>
-          </w:p>
-          <w:p>
-            <w:pPr>
-              <w:jc w:val="center"/>
-            </w:pPr>
-          </w:p>
-          <w:p>
-            <w:pPr>
-              <w:jc w:val="center"/>
-            </w:pPr>
-            <w:r>
-              <w:rPr>
-                <w:b/>
-                <w:bCs/>
-                <w:sz w:val="18"/>
-                <w:szCs w:val="18"/>
-              </w:rPr>
-              <w:t xml:space="preserve">« La sociologie :</w:t>
-            </w:r>
-          </w:p>
-          <w:p>
-            <w:pPr>
-              <w:jc w:val="center"/>
-            </w:pPr>
-            <w:r>
-              <w:rPr>
-                <w:b/>
-                <w:bCs/>
-                <w:sz w:val="18"/>
-                <w:szCs w:val="18"/>
-              </w:rPr>
-              <w:t xml:space="preserve">objet et méthode »</w:t>
+              <w:t xml:space="preserve">Contexte</w:t>
             </w:r>
           </w:p>
         </w:tc>
@@ -1404,297 +1847,78 @@
               <w:spacing w:after="30"/>
             </w:pPr>
             <w:r>
-              <w:rPr>
-                <w:b/>
-                <w:bCs/>
-              </w:rPr>
-              <w:t xml:space="preserve">Phénomènes proprement sociaux</w:t>
-            </w:r>
-            <w:r>
-              <w:t xml:space="preserve"> = distincts de ceux qu'étudie la psychologie → </w:t>
-            </w:r>
-            <w:r>
-              <w:rPr>
-                <w:b/>
-                <w:bCs/>
-              </w:rPr>
-              <w:t xml:space="preserve">matière de la sociologie</w:t>
-            </w:r>
-          </w:p>
-          <w:p>
-            <w:pPr>
-              <w:pStyle w:val="ListParagraph"/>
-              <w:numPr>
-                <w:ilvl w:val="0"/>
-                <w:numId w:val="2"/>
-              </w:numPr>
-              <w:spacing w:after="30"/>
-            </w:pPr>
-            <w:r>
-              <w:t xml:space="preserve">Le social est </w:t>
-            </w:r>
-            <w:r>
-              <w:rPr>
-                <w:b/>
-                <w:bCs/>
-                <w:shd w:fill="E4D9F0" w:color="auto" w:val="clear"/>
-              </w:rPr>
-              <w:t xml:space="preserve">surajouté</w:t>
-            </w:r>
-            <w:r>
-              <w:t xml:space="preserve"> à l'individuel : on contribue à le produire, mais il nous est </w:t>
-            </w:r>
-            <w:r>
-              <w:rPr>
-                <w:b/>
-                <w:bCs/>
-              </w:rPr>
-              <w:t xml:space="preserve">imposé du dehors</w:t>
-            </w:r>
-            <w:r>
-              <w:t xml:space="preserve"> (extériorité)</w:t>
-            </w:r>
-          </w:p>
-          <w:p>
-            <w:pPr>
-              <w:pStyle w:val="ListParagraph"/>
-              <w:numPr>
-                <w:ilvl w:val="0"/>
-                <w:numId w:val="2"/>
-              </w:numPr>
-              <w:spacing w:after="30"/>
-            </w:pPr>
-            <w:r>
-              <w:t xml:space="preserve">On le reconnaît à son </w:t>
-            </w:r>
-            <w:r>
-              <w:rPr>
-                <w:b/>
-                <w:bCs/>
-              </w:rPr>
-              <w:t xml:space="preserve">caractère obligatoire</w:t>
-            </w:r>
-            <w:r>
-              <w:t xml:space="preserve"> (sanctions, pression sociale), même s'il paraît « naturel » (ex : rôles de genre)</w:t>
-            </w:r>
-          </w:p>
-          <w:p>
-            <w:pPr>
-              <w:pStyle w:val="ListParagraph"/>
-              <w:numPr>
-                <w:ilvl w:val="0"/>
-                <w:numId w:val="2"/>
-              </w:numPr>
-              <w:spacing w:after="30"/>
-            </w:pPr>
-            <w:r>
-              <w:rPr>
-                <w:b/>
-                <w:bCs/>
-              </w:rPr>
-              <w:t xml:space="preserve">Transmission</w:t>
-            </w:r>
-            <w:r>
-              <w:t xml:space="preserve"> : </w:t>
-            </w:r>
-            <w:r>
-              <w:rPr>
-                <w:b/>
-                <w:bCs/>
-                <w:shd w:fill="FCEFB4" w:color="auto" w:val="clear"/>
-              </w:rPr>
-              <w:t xml:space="preserve">« sont sociales toutes les manières d'agir et de penser que l'individu trouve préétablies et dont la transmission se fait par la voie de l'éducation »</w:t>
-            </w:r>
-            <w:r>
-              <w:t xml:space="preserve"> → aujourd'hui = </w:t>
-            </w:r>
-            <w:r>
-              <w:rPr>
-                <w:b/>
-                <w:bCs/>
-              </w:rPr>
-              <w:t xml:space="preserve">socialisation</w:t>
-            </w:r>
-          </w:p>
-          <w:p>
-            <w:pPr>
-              <w:pStyle w:val="ListParagraph"/>
-              <w:numPr>
-                <w:ilvl w:val="0"/>
-                <w:numId w:val="2"/>
-              </w:numPr>
-              <w:spacing w:after="30"/>
-            </w:pPr>
-            <w:r>
-              <w:rPr>
-                <w:b/>
-                <w:bCs/>
-              </w:rPr>
-              <w:t xml:space="preserve">Définition</w:t>
-            </w:r>
-            <w:r>
-              <w:t xml:space="preserve"> : </w:t>
-            </w:r>
-            <w:r>
-              <w:rPr>
-                <w:b/>
-                <w:bCs/>
-                <w:shd w:fill="FCEFB4" w:color="auto" w:val="clear"/>
-              </w:rPr>
-              <w:t xml:space="preserve">institution = « ensemble d'actes ou d'idées tout institué que les individus trouvent devant eux et qui s'impose plus ou moins à eux »</w:t>
-            </w:r>
-          </w:p>
-          <w:p>
-            <w:pPr>
-              <w:pStyle w:val="ListParagraph"/>
-              <w:numPr>
-                <w:ilvl w:val="1"/>
-                <w:numId w:val="2"/>
-              </w:numPr>
-              <w:spacing w:after="30"/>
-            </w:pPr>
-            <w:r>
-              <w:rPr>
-                <w:b/>
-                <w:bCs/>
-              </w:rPr>
-              <w:t xml:space="preserve">Large</w:t>
-            </w:r>
-            <w:r>
-              <w:t xml:space="preserve"> : inclut les </w:t>
-            </w:r>
-            <w:r>
-              <w:rPr>
-                <w:b/>
-                <w:bCs/>
-              </w:rPr>
-              <w:t xml:space="preserve">usages, modes, préjugés, superstitions</w:t>
-            </w:r>
-            <w:r>
-              <w:t xml:space="preserve"> autant que les constitutions politiques et le droit → des institutions partout</w:t>
-            </w:r>
-          </w:p>
-          <w:p>
-            <w:pPr>
-              <w:pStyle w:val="ListParagraph"/>
-              <w:numPr>
-                <w:ilvl w:val="1"/>
-                <w:numId w:val="2"/>
-              </w:numPr>
-              <w:spacing w:after="30"/>
-            </w:pPr>
-            <w:r>
-              <w:t xml:space="preserve">« L'institution est dans l'ordre social ce qu'est la </w:t>
-            </w:r>
-            <w:r>
-              <w:rPr>
-                <w:b/>
-                <w:bCs/>
-              </w:rPr>
-              <w:t xml:space="preserve">fonction</w:t>
-            </w:r>
-            <w:r>
-              <w:t xml:space="preserve"> dans l'ordre biologique »</w:t>
-            </w:r>
-          </w:p>
-          <w:p>
-            <w:pPr>
-              <w:pStyle w:val="ListParagraph"/>
-              <w:numPr>
-                <w:ilvl w:val="0"/>
-                <w:numId w:val="2"/>
-              </w:numPr>
-              <w:spacing w:after="30"/>
-            </w:pPr>
-            <w:r>
-              <w:t xml:space="preserve">« Rien ne vient de rien » : les institutions </w:t>
-            </w:r>
-            <w:r>
-              <w:rPr>
-                <w:b/>
-                <w:bCs/>
-              </w:rPr>
-              <w:t xml:space="preserve">changent sans cesse</w:t>
-            </w:r>
-            <w:r>
-              <w:t xml:space="preserve"> → réponse à la critique « c'est du passé »</w:t>
-            </w:r>
-          </w:p>
-          <w:p>
-            <w:pPr>
-              <w:pStyle w:val="ListParagraph"/>
-              <w:numPr>
-                <w:ilvl w:val="0"/>
-                <w:numId w:val="2"/>
-              </w:numPr>
-              <w:spacing w:after="30"/>
-            </w:pPr>
-            <w:r>
-              <w:rPr>
-                <w:b/>
-                <w:bCs/>
-              </w:rPr>
-              <w:t xml:space="preserve">Objet de la sociologie</w:t>
-            </w:r>
-            <w:r>
-              <w:t xml:space="preserve"> = </w:t>
-            </w:r>
-            <w:r>
-              <w:rPr>
-                <w:b/>
-                <w:bCs/>
-                <w:shd w:fill="F7CFCF" w:color="auto" w:val="clear"/>
-              </w:rPr>
-              <w:t xml:space="preserve">les institutions VIVANTES : comment elles se forment, fonctionnent et se transforment</w:t>
-            </w:r>
-            <w:r>
-              <w:t xml:space="preserve"> (= leur dynamique)</w:t>
-            </w:r>
-          </w:p>
-          <w:p>
-            <w:pPr>
-              <w:pStyle w:val="ListParagraph"/>
-              <w:numPr>
-                <w:ilvl w:val="1"/>
-                <w:numId w:val="2"/>
-              </w:numPr>
-              <w:spacing w:after="30"/>
-            </w:pPr>
-            <w:r>
-              <w:t xml:space="preserve">Durkheim : la sociologie = « </w:t>
-            </w:r>
-            <w:r>
-              <w:rPr>
-                <w:b/>
-                <w:bCs/>
-              </w:rPr>
-              <w:t xml:space="preserve">science des institutions</w:t>
-            </w:r>
-            <w:r>
-              <w:t xml:space="preserve">, de leur genèse et de leur fonctionnement »</w:t>
-            </w:r>
-          </w:p>
-          <w:p>
-            <w:pPr>
-              <w:pStyle w:val="ListParagraph"/>
-              <w:numPr>
-                <w:ilvl w:val="1"/>
-                <w:numId w:val="2"/>
-              </w:numPr>
-              <w:spacing w:after="30"/>
-            </w:pPr>
-            <w:r>
-              <w:t xml:space="preserve">Critique de Durkheim : approche </w:t>
-            </w:r>
-            <w:r>
-              <w:rPr>
-                <w:b/>
-                <w:bCs/>
-              </w:rPr>
-              <w:t xml:space="preserve">génétique</w:t>
-            </w:r>
-            <w:r>
-              <w:t xml:space="preserve"> → il surestime les origines et néglige les transformations</w:t>
+              <w:t xml:space="preserve">Fin XIXe : la sociologie s'</w:t>
+            </w:r>
+            <w:r>
+              <w:rPr>
+                <w:b/>
+                <w:bCs/>
+              </w:rPr>
+              <w:t xml:space="preserve">institutionnalise</w:t>
+            </w:r>
+            <w:r>
+              <w:t xml:space="preserve"> grâce à </w:t>
+            </w:r>
+            <w:r>
+              <w:rPr>
+                <w:b/>
+                <w:bCs/>
+                <w:shd w:fill="D4EBCB" w:color="auto" w:val="clear"/>
+              </w:rPr>
+              <w:t xml:space="preserve">Émile Durkheim</w:t>
+            </w:r>
+            <w:r>
+              <w:t xml:space="preserve"> → elle doit se distinguer des autres disciplines, surtout de la </w:t>
+            </w:r>
+            <w:r>
+              <w:rPr>
+                <w:b/>
+                <w:bCs/>
+              </w:rPr>
+              <w:t xml:space="preserve">psychologie</w:t>
+            </w:r>
+            <w:r>
+              <w:t xml:space="preserve"> (concurrent direct). 1er cours de socio : </w:t>
+            </w:r>
+            <w:r>
+              <w:rPr>
+                <w:b/>
+                <w:bCs/>
+                <w:shd w:fill="FBDDBE" w:color="auto" w:val="clear"/>
+              </w:rPr>
+              <w:t xml:space="preserve">1902</w:t>
+            </w:r>
+          </w:p>
+          <w:p>
+            <w:pPr>
+              <w:pStyle w:val="ListParagraph"/>
+              <w:numPr>
+                <w:ilvl w:val="0"/>
+                <w:numId w:val="2"/>
+              </w:numPr>
+              <w:spacing w:after="30"/>
+            </w:pPr>
+            <w:r>
+              <w:rPr>
+                <w:b/>
+                <w:bCs/>
+                <w:shd w:fill="D4EBCB" w:color="auto" w:val="clear"/>
+              </w:rPr>
+              <w:t xml:space="preserve">Marcel Mauss</w:t>
+            </w:r>
+            <w:r>
+              <w:t xml:space="preserve"> (1873-1950) = neveu de Durkheim, père fondateur de l'ethnologie ; </w:t>
+            </w:r>
+            <w:r>
+              <w:rPr>
+                <w:b/>
+                <w:bCs/>
+                <w:shd w:fill="D4EBCB" w:color="auto" w:val="clear"/>
+              </w:rPr>
+              <w:t xml:space="preserve">Paul Fauconnet</w:t>
+            </w:r>
+            <w:r>
+              <w:t xml:space="preserve"> (1874-1938)</w:t>
             </w:r>
           </w:p>
         </w:tc>
@@ -1732,7 +1956,68 @@
                 <w:sz w:val="18"/>
                 <w:szCs w:val="18"/>
               </w:rPr>
-              <w:t xml:space="preserve">Socialisation</w:t>
+              <w:t xml:space="preserve">Texte 1</w:t>
+            </w:r>
+          </w:p>
+          <w:p>
+            <w:pPr>
+              <w:jc w:val="center"/>
+            </w:pPr>
+            <w:r>
+              <w:rPr>
+                <w:b/>
+                <w:bCs/>
+                <w:sz w:val="18"/>
+                <w:szCs w:val="18"/>
+              </w:rPr>
+              <w:t xml:space="preserve">Mauss &amp;</w:t>
+            </w:r>
+          </w:p>
+          <w:p>
+            <w:pPr>
+              <w:jc w:val="center"/>
+            </w:pPr>
+            <w:r>
+              <w:rPr>
+                <w:b/>
+                <w:bCs/>
+                <w:sz w:val="18"/>
+                <w:szCs w:val="18"/>
+              </w:rPr>
+              <w:t xml:space="preserve">Fauconnet</w:t>
+            </w:r>
+          </w:p>
+          <w:p>
+            <w:pPr>
+              <w:jc w:val="center"/>
+            </w:pPr>
+          </w:p>
+          <w:p>
+            <w:pPr>
+              <w:jc w:val="center"/>
+            </w:pPr>
+            <w:r>
+              <w:rPr>
+                <w:b/>
+                <w:bCs/>
+                <w:sz w:val="18"/>
+                <w:szCs w:val="18"/>
+              </w:rPr>
+              <w:t xml:space="preserve">« La sociologie :</w:t>
+            </w:r>
+          </w:p>
+          <w:p>
+            <w:pPr>
+              <w:jc w:val="center"/>
+            </w:pPr>
+            <w:r>
+              <w:rPr>
+                <w:b/>
+                <w:bCs/>
+                <w:sz w:val="18"/>
+                <w:szCs w:val="18"/>
+              </w:rPr>
+              <w:t xml:space="preserve">objet et méthode »</w:t>
             </w:r>
           </w:p>
         </w:tc>
@@ -1763,25 +2048,344 @@
               <w:spacing w:after="30"/>
             </w:pPr>
             <w:r>
+              <w:t xml:space="preserve">Objectif : </w:t>
+            </w:r>
+            <w:r>
+              <w:rPr>
+                <w:b/>
+                <w:bCs/>
+              </w:rPr>
+              <w:t xml:space="preserve">définir la sociologie</w:t>
+            </w:r>
+            <w:r>
+              <w:t xml:space="preserve"> → pour définir une science, on définit son </w:t>
+            </w:r>
+            <w:r>
+              <w:rPr>
+                <w:b/>
+                <w:bCs/>
+              </w:rPr>
+              <w:t xml:space="preserve">objet</w:t>
+            </w:r>
+          </w:p>
+          <w:p>
+            <w:pPr>
+              <w:pStyle w:val="ListParagraph"/>
+              <w:numPr>
+                <w:ilvl w:val="0"/>
+                <w:numId w:val="2"/>
+              </w:numPr>
+              <w:spacing w:after="30"/>
+            </w:pPr>
+            <w:r>
+              <w:rPr>
+                <w:b/>
+                <w:bCs/>
+              </w:rPr>
+              <w:t xml:space="preserve">Phénomènes proprement sociaux</w:t>
+            </w:r>
+            <w:r>
+              <w:t xml:space="preserve"> = distincts de ceux qu'étudie la psychologie → </w:t>
+            </w:r>
+            <w:r>
+              <w:rPr>
+                <w:b/>
+                <w:bCs/>
+              </w:rPr>
+              <w:t xml:space="preserve">matière de la sociologie</w:t>
+            </w:r>
+          </w:p>
+          <w:p>
+            <w:pPr>
+              <w:pStyle w:val="ListParagraph"/>
+              <w:numPr>
+                <w:ilvl w:val="0"/>
+                <w:numId w:val="2"/>
+              </w:numPr>
+              <w:spacing w:after="30"/>
+            </w:pPr>
+            <w:r>
+              <w:t xml:space="preserve">Le social est </w:t>
+            </w:r>
+            <w:r>
+              <w:rPr>
+                <w:b/>
+                <w:bCs/>
+                <w:shd w:fill="E4D9F0" w:color="auto" w:val="clear"/>
+              </w:rPr>
+              <w:t xml:space="preserve">surajouté</w:t>
+            </w:r>
+            <w:r>
+              <w:t xml:space="preserve"> à l'individuel : on contribue à le produire, mais il nous est </w:t>
+            </w:r>
+            <w:r>
+              <w:rPr>
+                <w:b/>
+                <w:bCs/>
+              </w:rPr>
+              <w:t xml:space="preserve">imposé du dehors</w:t>
+            </w:r>
+            <w:r>
+              <w:t xml:space="preserve"> (extériorité)</w:t>
+            </w:r>
+          </w:p>
+          <w:p>
+            <w:pPr>
+              <w:pStyle w:val="ListParagraph"/>
+              <w:numPr>
+                <w:ilvl w:val="0"/>
+                <w:numId w:val="2"/>
+              </w:numPr>
+              <w:spacing w:after="30"/>
+            </w:pPr>
+            <w:r>
+              <w:t xml:space="preserve">On le reconnaît à son </w:t>
+            </w:r>
+            <w:r>
+              <w:rPr>
+                <w:b/>
+                <w:bCs/>
+              </w:rPr>
+              <w:t xml:space="preserve">caractère obligatoire</w:t>
+            </w:r>
+            <w:r>
+              <w:t xml:space="preserve"> (sanctions, pression sociale), même s'il paraît « naturel » (ex : rôles de genre)</w:t>
+            </w:r>
+          </w:p>
+          <w:p>
+            <w:pPr>
+              <w:pStyle w:val="ListParagraph"/>
+              <w:numPr>
+                <w:ilvl w:val="0"/>
+                <w:numId w:val="2"/>
+              </w:numPr>
+              <w:spacing w:after="30"/>
+            </w:pPr>
+            <w:r>
+              <w:t xml:space="preserve">2ᵉ critère : ils sont </w:t>
+            </w:r>
+            <w:r>
+              <w:rPr>
+                <w:b/>
+                <w:bCs/>
+              </w:rPr>
+              <w:t xml:space="preserve">institués</w:t>
+            </w:r>
+            <w:r>
+              <w:t xml:space="preserve"> (habitudes, manières de faire) et se transmettent par l'</w:t>
+            </w:r>
+            <w:r>
+              <w:rPr>
+                <w:b/>
+                <w:bCs/>
+              </w:rPr>
+              <w:t xml:space="preserve">éducation</w:t>
+            </w:r>
+            <w:r>
+              <w:t xml:space="preserve"> = ce qu'on appelle aujourd'hui la </w:t>
+            </w:r>
+            <w:r>
+              <w:rPr>
+                <w:b/>
+                <w:bCs/>
+              </w:rPr>
+              <w:t xml:space="preserve">socialisation</w:t>
+            </w:r>
+          </w:p>
+          <w:p>
+            <w:pPr>
+              <w:pStyle w:val="ListParagraph"/>
+              <w:numPr>
+                <w:ilvl w:val="0"/>
+                <w:numId w:val="2"/>
+              </w:numPr>
+              <w:spacing w:after="30"/>
+            </w:pPr>
+            <w:r>
+              <w:t xml:space="preserve">Définition large car ils donnent </w:t>
+            </w:r>
+            <w:r>
+              <w:rPr>
+                <w:b/>
+                <w:bCs/>
+              </w:rPr>
+              <w:t xml:space="preserve">beaucoup d'exemples</w:t>
+            </w:r>
+            <w:r>
+              <w:t xml:space="preserve"> : ça dépasse la simple description</w:t>
+            </w:r>
+          </w:p>
+          <w:p>
+            <w:pPr>
+              <w:pStyle w:val="ListParagraph"/>
+              <w:numPr>
+                <w:ilvl w:val="0"/>
+                <w:numId w:val="2"/>
+              </w:numPr>
+              <w:spacing w:after="30"/>
+            </w:pPr>
+            <w:r>
+              <w:rPr>
+                <w:b/>
+                <w:bCs/>
+              </w:rPr>
+              <w:t xml:space="preserve">Transmission</w:t>
+            </w:r>
+            <w:r>
+              <w:t xml:space="preserve"> : </w:t>
+            </w:r>
+            <w:r>
               <w:rPr>
                 <w:b/>
                 <w:bCs/>
                 <w:shd w:fill="FCEFB4" w:color="auto" w:val="clear"/>
               </w:rPr>
-              <w:t xml:space="preserve">Socialisation = processus par lequel l'individu intègre les normes, valeurs, habitudes et croyances de la société et de ses groupes</w:t>
-            </w:r>
-          </w:p>
-          <w:p>
-            <w:pPr>
-              <w:pStyle w:val="ListParagraph"/>
-              <w:numPr>
-                <w:ilvl w:val="0"/>
-                <w:numId w:val="2"/>
-              </w:numPr>
-              <w:spacing w:after="30"/>
-            </w:pPr>
-            <w:r>
-              <w:t xml:space="preserve">« Être moral, c'est être social »</w:t>
+              <w:t xml:space="preserve">« sont sociales toutes les manières d'agir et de penser que l'individu trouve préétablies et dont la transmission se fait par la voie de l'éducation »</w:t>
+            </w:r>
+            <w:r>
+              <w:t xml:space="preserve"> → aujourd'hui = </w:t>
+            </w:r>
+            <w:r>
+              <w:rPr>
+                <w:b/>
+                <w:bCs/>
+              </w:rPr>
+              <w:t xml:space="preserve">socialisation</w:t>
+            </w:r>
+          </w:p>
+          <w:p>
+            <w:pPr>
+              <w:pStyle w:val="ListParagraph"/>
+              <w:numPr>
+                <w:ilvl w:val="0"/>
+                <w:numId w:val="2"/>
+              </w:numPr>
+              <w:spacing w:after="30"/>
+            </w:pPr>
+            <w:r>
+              <w:rPr>
+                <w:b/>
+                <w:bCs/>
+              </w:rPr>
+              <w:t xml:space="preserve">Définition</w:t>
+            </w:r>
+            <w:r>
+              <w:t xml:space="preserve"> : </w:t>
+            </w:r>
+            <w:r>
+              <w:rPr>
+                <w:b/>
+                <w:bCs/>
+                <w:shd w:fill="FCEFB4" w:color="auto" w:val="clear"/>
+              </w:rPr>
+              <w:t xml:space="preserve">institution = « ensemble d'actes ou d'idées tout institué que les individus trouvent devant eux et qui s'impose plus ou moins à eux »</w:t>
+            </w:r>
+          </w:p>
+          <w:p>
+            <w:pPr>
+              <w:pStyle w:val="ListParagraph"/>
+              <w:numPr>
+                <w:ilvl w:val="1"/>
+                <w:numId w:val="2"/>
+              </w:numPr>
+              <w:spacing w:after="30"/>
+            </w:pPr>
+            <w:r>
+              <w:rPr>
+                <w:b/>
+                <w:bCs/>
+              </w:rPr>
+              <w:t xml:space="preserve">Large</w:t>
+            </w:r>
+            <w:r>
+              <w:t xml:space="preserve"> : inclut les </w:t>
+            </w:r>
+            <w:r>
+              <w:rPr>
+                <w:b/>
+                <w:bCs/>
+              </w:rPr>
+              <w:t xml:space="preserve">usages, modes, préjugés, superstitions</w:t>
+            </w:r>
+            <w:r>
+              <w:t xml:space="preserve"> autant que les constitutions politiques et le droit → des institutions partout</w:t>
+            </w:r>
+          </w:p>
+          <w:p>
+            <w:pPr>
+              <w:pStyle w:val="ListParagraph"/>
+              <w:numPr>
+                <w:ilvl w:val="1"/>
+                <w:numId w:val="2"/>
+              </w:numPr>
+              <w:spacing w:after="30"/>
+            </w:pPr>
+            <w:r>
+              <w:t xml:space="preserve">« L'institution est dans l'ordre social ce qu'est la </w:t>
+            </w:r>
+            <w:r>
+              <w:rPr>
+                <w:b/>
+                <w:bCs/>
+              </w:rPr>
+              <w:t xml:space="preserve">fonction</w:t>
+            </w:r>
+            <w:r>
+              <w:t xml:space="preserve"> dans l'ordre biologique »</w:t>
+            </w:r>
+          </w:p>
+          <w:p>
+            <w:pPr>
+              <w:pStyle w:val="ListParagraph"/>
+              <w:numPr>
+                <w:ilvl w:val="0"/>
+                <w:numId w:val="2"/>
+              </w:numPr>
+              <w:spacing w:after="30"/>
+            </w:pPr>
+            <w:r>
+              <w:t xml:space="preserve">« Rien ne vient de rien » : les institutions </w:t>
+            </w:r>
+            <w:r>
+              <w:rPr>
+                <w:b/>
+                <w:bCs/>
+              </w:rPr>
+              <w:t xml:space="preserve">changent sans cesse</w:t>
+            </w:r>
+            <w:r>
+              <w:t xml:space="preserve"> → réponse à la critique « c'est du passé »</w:t>
+            </w:r>
+          </w:p>
+          <w:p>
+            <w:pPr>
+              <w:pStyle w:val="ListParagraph"/>
+              <w:numPr>
+                <w:ilvl w:val="0"/>
+                <w:numId w:val="2"/>
+              </w:numPr>
+              <w:spacing w:after="30"/>
+            </w:pPr>
+            <w:r>
+              <w:rPr>
+                <w:b/>
+                <w:bCs/>
+              </w:rPr>
+              <w:t xml:space="preserve">Objet de la sociologie</w:t>
+            </w:r>
+            <w:r>
+              <w:t xml:space="preserve"> = </w:t>
+            </w:r>
+            <w:r>
+              <w:rPr>
+                <w:b/>
+                <w:bCs/>
+                <w:shd w:fill="F7CFCF" w:color="auto" w:val="clear"/>
+              </w:rPr>
+              <w:t xml:space="preserve">les institutions VIVANTES : comment elles se forment, fonctionnent et se transforment</w:t>
+            </w:r>
+            <w:r>
+              <w:t xml:space="preserve"> (= leur dynamique)</w:t>
             </w:r>
           </w:p>
         </w:tc>
@@ -1819,7 +2423,7 @@
                 <w:sz w:val="18"/>
                 <w:szCs w:val="18"/>
               </w:rPr>
-              <w:t xml:space="preserve">Texte 2</w:t>
+              <w:t xml:space="preserve">Émile</w:t>
             </w:r>
           </w:p>
           <w:p>
@@ -1836,53 +2440,6 @@
               <w:t xml:space="preserve">Durkheim</w:t>
             </w:r>
           </w:p>
-          <w:p>
-            <w:pPr>
-              <w:jc w:val="center"/>
-            </w:pPr>
-          </w:p>
-          <w:p>
-            <w:pPr>
-              <w:jc w:val="center"/>
-            </w:pPr>
-            <w:r>
-              <w:rPr>
-                <w:b/>
-                <w:bCs/>
-                <w:sz w:val="18"/>
-                <w:szCs w:val="18"/>
-              </w:rPr>
-              <w:t xml:space="preserve">L'évolution</w:t>
-            </w:r>
-          </w:p>
-          <w:p>
-            <w:pPr>
-              <w:jc w:val="center"/>
-            </w:pPr>
-            <w:r>
-              <w:rPr>
-                <w:b/>
-                <w:bCs/>
-                <w:sz w:val="18"/>
-                <w:szCs w:val="18"/>
-              </w:rPr>
-              <w:t xml:space="preserve">pédagogique</w:t>
-            </w:r>
-          </w:p>
-          <w:p>
-            <w:pPr>
-              <w:jc w:val="center"/>
-            </w:pPr>
-            <w:r>
-              <w:rPr>
-                <w:b/>
-                <w:bCs/>
-                <w:sz w:val="18"/>
-                <w:szCs w:val="18"/>
-              </w:rPr>
-              <w:t xml:space="preserve">en France</w:t>
-            </w:r>
-          </w:p>
         </w:tc>
         <w:tc>
           <w:tcPr>
@@ -1914,104 +2471,130 @@
               <w:rPr>
                 <w:b/>
                 <w:bCs/>
-              </w:rPr>
-              <w:t xml:space="preserve">École de l'Antiquité</w:t>
-            </w:r>
-            <w:r>
-              <w:t xml:space="preserve"> : maîtres séparés, enseignements sans lien → transmet des </w:t>
-            </w:r>
-            <w:r>
-              <w:rPr>
-                <w:b/>
-                <w:bCs/>
-              </w:rPr>
-              <w:t xml:space="preserve">savoirs/talents</w:t>
-            </w:r>
-            <w:r>
-              <w:t xml:space="preserve">, ne travaille pas l'individu en profondeur → </w:t>
-            </w:r>
-            <w:r>
-              <w:rPr>
-                <w:b/>
-                <w:bCs/>
-              </w:rPr>
-              <w:t xml:space="preserve">pas vraiment une institution</w:t>
-            </w:r>
-          </w:p>
-          <w:p>
-            <w:pPr>
-              <w:pStyle w:val="ListParagraph"/>
-              <w:numPr>
-                <w:ilvl w:val="0"/>
-                <w:numId w:val="2"/>
-              </w:numPr>
-              <w:spacing w:after="30"/>
-            </w:pPr>
-            <w:r>
-              <w:rPr>
-                <w:b/>
-                <w:bCs/>
-              </w:rPr>
-              <w:t xml:space="preserve">École chrétienne</w:t>
-            </w:r>
-            <w:r>
-              <w:t xml:space="preserve"> : un seul </w:t>
-            </w:r>
-            <w:r>
-              <w:rPr>
-                <w:b/>
-                <w:bCs/>
-              </w:rPr>
-              <w:t xml:space="preserve">milieu moral</w:t>
-            </w:r>
-            <w:r>
-              <w:t xml:space="preserve"> qui enveloppe l'enfant (internat), une seule influence → vise une </w:t>
-            </w:r>
-            <w:r>
-              <w:rPr>
-                <w:b/>
-                <w:bCs/>
-              </w:rPr>
-              <w:t xml:space="preserve">conversion</w:t>
-            </w:r>
-            <w:r>
-              <w:t xml:space="preserve">, un « état profond » de l'âme</w:t>
-            </w:r>
-          </w:p>
-          <w:p>
-            <w:pPr>
-              <w:pStyle w:val="ListParagraph"/>
-              <w:numPr>
-                <w:ilvl w:val="1"/>
-                <w:numId w:val="2"/>
-              </w:numPr>
-              <w:spacing w:after="30"/>
-            </w:pPr>
-            <w:r>
-              <w:t xml:space="preserve">→ à l'origine de l'</w:t>
-            </w:r>
-            <w:r>
-              <w:rPr>
-                <w:b/>
-                <w:bCs/>
-              </w:rPr>
-              <w:t xml:space="preserve">institution scolaire</w:t>
-            </w:r>
-            <w:r>
-              <w:t xml:space="preserve"> actuelle (but sécularisé : « en faire un homme »)</w:t>
-            </w:r>
-          </w:p>
-          <w:p>
-            <w:pPr>
-              <w:pStyle w:val="ListParagraph"/>
-              <w:numPr>
-                <w:ilvl w:val="0"/>
-                <w:numId w:val="2"/>
-              </w:numPr>
-              <w:spacing w:after="30"/>
-            </w:pPr>
-            <w:r>
-              <w:t xml:space="preserve">Les institutions créent des </w:t>
+                <w:shd w:fill="D4EBCB" w:color="auto" w:val="clear"/>
+              </w:rPr>
+              <w:t xml:space="preserve">Émile Durkheim</w:t>
+            </w:r>
+            <w:r>
+              <w:t xml:space="preserve"> = </w:t>
+            </w:r>
+            <w:r>
+              <w:rPr>
+                <w:b/>
+                <w:bCs/>
+              </w:rPr>
+              <w:t xml:space="preserve">père fondateur de la sociologie en France</w:t>
+            </w:r>
+          </w:p>
+          <w:p>
+            <w:pPr>
+              <w:pStyle w:val="ListParagraph"/>
+              <w:numPr>
+                <w:ilvl w:val="0"/>
+                <w:numId w:val="2"/>
+              </w:numPr>
+              <w:spacing w:after="30"/>
+            </w:pPr>
+            <w:r>
+              <w:t xml:space="preserve">Œuvres : </w:t>
+            </w:r>
+            <w:r>
+              <w:rPr>
+                <w:b/>
+                <w:bCs/>
+                <w:shd w:fill="FBDDBE" w:color="auto" w:val="clear"/>
+              </w:rPr>
+              <w:t xml:space="preserve">De la division du travail social (1893)</w:t>
+            </w:r>
+            <w:r>
+              <w:t xml:space="preserve"> · </w:t>
+            </w:r>
+            <w:r>
+              <w:rPr>
+                <w:b/>
+                <w:bCs/>
+                <w:shd w:fill="FBDDBE" w:color="auto" w:val="clear"/>
+              </w:rPr>
+              <w:t xml:space="preserve">Les règles de la méthode sociologique (1895)</w:t>
+            </w:r>
+            <w:r>
+              <w:t xml:space="preserve"> · </w:t>
+            </w:r>
+            <w:r>
+              <w:rPr>
+                <w:b/>
+                <w:bCs/>
+                <w:shd w:fill="FBDDBE" w:color="auto" w:val="clear"/>
+              </w:rPr>
+              <w:t xml:space="preserve">Le suicide (1897)</w:t>
+            </w:r>
+            <w:r>
+              <w:t xml:space="preserve"> · </w:t>
+            </w:r>
+            <w:r>
+              <w:rPr>
+                <w:b/>
+                <w:bCs/>
+                <w:shd w:fill="FBDDBE" w:color="auto" w:val="clear"/>
+              </w:rPr>
+              <w:t xml:space="preserve">Les formes élémentaires de la vie religieuse (1912)</w:t>
+            </w:r>
+          </w:p>
+          <w:p>
+            <w:pPr>
+              <w:pStyle w:val="ListParagraph"/>
+              <w:numPr>
+                <w:ilvl w:val="0"/>
+                <w:numId w:val="2"/>
+              </w:numPr>
+              <w:spacing w:after="30"/>
+            </w:pPr>
+            <w:r>
+              <w:t xml:space="preserve">La sociologie = </w:t>
+            </w:r>
+            <w:r>
+              <w:rPr>
+                <w:b/>
+                <w:bCs/>
+                <w:shd w:fill="FCEFB4" w:color="auto" w:val="clear"/>
+              </w:rPr>
+              <w:t xml:space="preserve">« science des institutions, de leur genèse et de leur fonctionnement »</w:t>
+            </w:r>
+          </w:p>
+          <w:p>
+            <w:pPr>
+              <w:pStyle w:val="ListParagraph"/>
+              <w:numPr>
+                <w:ilvl w:val="0"/>
+                <w:numId w:val="2"/>
+              </w:numPr>
+              <w:spacing w:after="30"/>
+            </w:pPr>
+            <w:r>
+              <w:t xml:space="preserve">« Il en est des institutions sociales, quelles qu'elles soient, comme des êtres vivants. Leur avenir, le sens dans lequel elles se développent, la force qu'elles présentent dans leur devenir dépendent étroitement de la nature du premier germe dont elles sont sorties »</w:t>
+            </w:r>
+          </w:p>
+          <w:p>
+            <w:pPr>
+              <w:pStyle w:val="ListParagraph"/>
+              <w:numPr>
+                <w:ilvl w:val="0"/>
+                <w:numId w:val="2"/>
+              </w:numPr>
+              <w:spacing w:after="30"/>
+            </w:pPr>
+            <w:r>
+              <w:t xml:space="preserve">→ conception </w:t>
+            </w:r>
+            <w:r>
+              <w:rPr>
+                <w:b/>
+                <w:bCs/>
+              </w:rPr>
+              <w:t xml:space="preserve">germinative</w:t>
+            </w:r>
+            <w:r>
+              <w:t xml:space="preserve"> (l'institution se transforme à partir d'un germe) + </w:t>
             </w:r>
             <w:r>
               <w:rPr>
@@ -2019,41 +2602,17 @@
                 <w:bCs/>
                 <w:shd w:fill="E4D9F0" w:color="auto" w:val="clear"/>
               </w:rPr>
-              <w:t xml:space="preserve">dispositions profondes</w:t>
-            </w:r>
-            <w:r>
-              <w:t xml:space="preserve"> : </w:t>
-            </w:r>
-            <w:r>
-              <w:rPr>
-                <w:b/>
-                <w:bCs/>
-                <w:shd w:fill="FCEFB4" w:color="auto" w:val="clear"/>
-              </w:rPr>
-              <w:t xml:space="preserve">manières durables et profondément intériorisées de penser et d'agir</w:t>
-            </w:r>
-          </w:p>
-          <w:p>
-            <w:pPr>
-              <w:pStyle w:val="ListParagraph"/>
-              <w:numPr>
-                <w:ilvl w:val="1"/>
-                <w:numId w:val="2"/>
-              </w:numPr>
-              <w:spacing w:after="30"/>
-            </w:pPr>
-            <w:r>
-              <w:t xml:space="preserve">→ on agit </w:t>
-            </w:r>
-            <w:r>
-              <w:rPr>
-                <w:b/>
-                <w:bCs/>
-              </w:rPr>
-              <w:t xml:space="preserve">sans y penser</w:t>
-            </w:r>
-            <w:r>
-              <w:t xml:space="preserve">, comme on respire (= naturalisation)</w:t>
+              <w:t xml:space="preserve">approche génétique</w:t>
+            </w:r>
+            <w:r>
+              <w:t xml:space="preserve"> (le début est structurant) : pour comprendre une institution aujourd'hui, </w:t>
+            </w:r>
+            <w:r>
+              <w:rPr>
+                <w:b/>
+                <w:bCs/>
+              </w:rPr>
+              <w:t xml:space="preserve">il faut regarder le passé</w:t>
             </w:r>
           </w:p>
           <w:p>
@@ -2071,20 +2630,53 @@
                 <w:bCs/>
                 <w:shd w:fill="F7CFCF" w:color="auto" w:val="clear"/>
               </w:rPr>
-              <w:t xml:space="preserve">Leçon : l'institution = espace de SOCIALISATION</w:t>
-            </w:r>
-            <w:r>
-              <w:t xml:space="preserve"> ; elle est </w:t>
-            </w:r>
-            <w:r>
-              <w:rPr>
-                <w:b/>
-                <w:bCs/>
-              </w:rPr>
-              <w:t xml:space="preserve">vivante</w:t>
-            </w:r>
-            <w:r>
-              <w:t xml:space="preserve">, elle se transforme</w:t>
+              <w:t xml:space="preserve">Critiques</w:t>
+            </w:r>
+            <w:r>
+              <w:t xml:space="preserve"> : ① il </w:t>
+            </w:r>
+            <w:r>
+              <w:rPr>
+                <w:b/>
+                <w:bCs/>
+              </w:rPr>
+              <w:t xml:space="preserve">surdimensionne le début</w:t>
+            </w:r>
+            <w:r>
+              <w:t xml:space="preserve"> (presque tout serait joué dès le début) ② il pense qu'il y a vraiment </w:t>
+            </w:r>
+            <w:r>
+              <w:rPr>
+                <w:b/>
+                <w:bCs/>
+              </w:rPr>
+              <w:t xml:space="preserve">un début</w:t>
+            </w:r>
+            <w:r>
+              <w:t xml:space="preserve"> aux institutions, alors que non ③ il </w:t>
+            </w:r>
+            <w:r>
+              <w:rPr>
+                <w:b/>
+                <w:bCs/>
+              </w:rPr>
+              <w:t xml:space="preserve">minore les changements ultérieurs</w:t>
+            </w:r>
+            <w:r>
+              <w:t xml:space="preserve">, le travail du présent</w:t>
+            </w:r>
+          </w:p>
+          <w:p>
+            <w:pPr>
+              <w:pStyle w:val="ListParagraph"/>
+              <w:numPr>
+                <w:ilvl w:val="0"/>
+                <w:numId w:val="2"/>
+              </w:numPr>
+              <w:spacing w:after="30"/>
+            </w:pPr>
+            <w:r>
+              <w:t xml:space="preserve">→ démarche intéressante, mais avec de petites failles</w:t>
             </w:r>
           </w:p>
         </w:tc>
@@ -2122,54 +2714,7 @@
                 <w:sz w:val="18"/>
                 <w:szCs w:val="18"/>
               </w:rPr>
-              <w:t xml:space="preserve">Texte 3</w:t>
-            </w:r>
-          </w:p>
-          <w:p>
-            <w:pPr>
-              <w:jc w:val="center"/>
-            </w:pPr>
-            <w:r>
-              <w:rPr>
-                <w:b/>
-                <w:bCs/>
-                <w:sz w:val="18"/>
-                <w:szCs w:val="18"/>
-              </w:rPr>
-              <w:t xml:space="preserve">Weber</w:t>
-            </w:r>
-          </w:p>
-          <w:p>
-            <w:pPr>
-              <w:jc w:val="center"/>
-            </w:pPr>
-          </w:p>
-          <w:p>
-            <w:pPr>
-              <w:jc w:val="center"/>
-            </w:pPr>
-            <w:r>
-              <w:rPr>
-                <w:b/>
-                <w:bCs/>
-                <w:sz w:val="18"/>
-                <w:szCs w:val="18"/>
-              </w:rPr>
-              <w:t xml:space="preserve">Le savant</w:t>
-            </w:r>
-          </w:p>
-          <w:p>
-            <w:pPr>
-              <w:jc w:val="center"/>
-            </w:pPr>
-            <w:r>
-              <w:rPr>
-                <w:b/>
-                <w:bCs/>
-                <w:sz w:val="18"/>
-                <w:szCs w:val="18"/>
-              </w:rPr>
-              <w:t xml:space="preserve">et le politique</w:t>
+              <w:t xml:space="preserve">Socialisation</w:t>
             </w:r>
           </w:p>
         </w:tc>
@@ -2203,222 +2748,45 @@
               <w:rPr>
                 <w:b/>
                 <w:bCs/>
-                <w:shd w:fill="D4EBCB" w:color="auto" w:val="clear"/>
-              </w:rPr>
-              <w:t xml:space="preserve">Max Weber</w:t>
-            </w:r>
-            <w:r>
-              <w:t xml:space="preserve"> (allemand) prend l'exemple de l'</w:t>
-            </w:r>
-            <w:r>
-              <w:rPr>
-                <w:b/>
-                <w:bCs/>
-              </w:rPr>
-              <w:t xml:space="preserve">État</w:t>
-            </w:r>
-          </w:p>
-          <w:p>
-            <w:pPr>
-              <w:pStyle w:val="ListParagraph"/>
-              <w:numPr>
-                <w:ilvl w:val="0"/>
-                <w:numId w:val="2"/>
-              </w:numPr>
-              <w:spacing w:after="30"/>
-            </w:pPr>
-            <w:r>
-              <w:t xml:space="preserve">On ne définit pas l'État par </w:t>
-            </w:r>
-            <w:r>
-              <w:rPr>
-                <w:b/>
-                <w:bCs/>
-              </w:rPr>
-              <w:t xml:space="preserve">ce qu'il fait</w:t>
-            </w:r>
-            <w:r>
-              <w:t xml:space="preserve">, mais par son </w:t>
-            </w:r>
-            <w:r>
-              <w:rPr>
-                <w:b/>
-                <w:bCs/>
-              </w:rPr>
-              <w:t xml:space="preserve">moyen spécifique</w:t>
-            </w:r>
-            <w:r>
-              <w:t xml:space="preserve"> : </w:t>
-            </w:r>
-            <w:r>
-              <w:rPr>
-                <w:b/>
-                <w:bCs/>
                 <w:shd w:fill="FCEFB4" w:color="auto" w:val="clear"/>
               </w:rPr>
-              <w:t xml:space="preserve">le monopole de la violence physique légitime</w:t>
-            </w:r>
-            <w:r>
-              <w:t xml:space="preserve"> (sur un territoire)</w:t>
-            </w:r>
-          </w:p>
-          <w:p>
-            <w:pPr>
-              <w:pStyle w:val="ListParagraph"/>
-              <w:numPr>
-                <w:ilvl w:val="0"/>
-                <w:numId w:val="2"/>
-              </w:numPr>
-              <w:spacing w:after="30"/>
-            </w:pPr>
-            <w:r>
-              <w:t xml:space="preserve">L'État = rapport de </w:t>
-            </w:r>
-            <w:r>
-              <w:rPr>
-                <w:b/>
-                <w:bCs/>
-              </w:rPr>
-              <w:t xml:space="preserve">domination</w:t>
-            </w:r>
-            <w:r>
-              <w:t xml:space="preserve"> fondé sur la violence </w:t>
-            </w:r>
-            <w:r>
-              <w:rPr>
-                <w:b/>
-                <w:bCs/>
-              </w:rPr>
-              <w:t xml:space="preserve">légitime</w:t>
-            </w:r>
-            <w:r>
-              <w:t xml:space="preserve"> → les dominés se soumettent à l'autorité revendiquée</w:t>
-            </w:r>
-          </w:p>
-          <w:p>
-            <w:pPr>
-              <w:pStyle w:val="ListParagraph"/>
-              <w:numPr>
-                <w:ilvl w:val="0"/>
-                <w:numId w:val="2"/>
-              </w:numPr>
-              <w:spacing w:after="30"/>
-            </w:pPr>
-            <w:r>
-              <w:t xml:space="preserve">Leçons : une institution se définit par ① ses </w:t>
-            </w:r>
-            <w:r>
-              <w:rPr>
-                <w:b/>
-                <w:bCs/>
-              </w:rPr>
-              <w:t xml:space="preserve">moyens d'agir</w:t>
-            </w:r>
-            <w:r>
-              <w:t xml:space="preserve"> ② la </w:t>
-            </w:r>
-            <w:r>
-              <w:rPr>
-                <w:b/>
-                <w:bCs/>
-              </w:rPr>
-              <w:t xml:space="preserve">justification / légitimation</w:t>
-            </w:r>
-            <w:r>
-              <w:t xml:space="preserve"> de ses actions</w:t>
-            </w:r>
-          </w:p>
-          <w:p>
-            <w:pPr>
-              <w:pStyle w:val="ListParagraph"/>
-              <w:numPr>
-                <w:ilvl w:val="0"/>
-                <w:numId w:val="2"/>
-              </w:numPr>
-              <w:spacing w:after="30"/>
-            </w:pPr>
-            <w:r>
-              <w:rPr>
-                <w:b/>
-                <w:bCs/>
-                <w:shd w:fill="E4D9F0" w:color="auto" w:val="clear"/>
-              </w:rPr>
-              <w:t xml:space="preserve">Pouvoir</w:t>
-            </w:r>
-            <w:r>
-              <w:t xml:space="preserve"> : capacité à imposer quelque chose à quelqu'un (quels que soient les moyens)</w:t>
-            </w:r>
-          </w:p>
-          <w:p>
-            <w:pPr>
-              <w:pStyle w:val="ListParagraph"/>
-              <w:numPr>
-                <w:ilvl w:val="0"/>
-                <w:numId w:val="2"/>
-              </w:numPr>
-              <w:spacing w:after="30"/>
-            </w:pPr>
-            <w:r>
-              <w:rPr>
-                <w:b/>
-                <w:bCs/>
-                <w:shd w:fill="E4D9F0" w:color="auto" w:val="clear"/>
-              </w:rPr>
-              <w:t xml:space="preserve">Domination</w:t>
-            </w:r>
-            <w:r>
-              <w:t xml:space="preserve"> : rapport de pouvoir </w:t>
-            </w:r>
-            <w:r>
-              <w:rPr>
-                <w:b/>
-                <w:bCs/>
-              </w:rPr>
-              <w:t xml:space="preserve">légitimé</w:t>
-            </w:r>
-            <w:r>
-              <w:t xml:space="preserve">, que les dominés </w:t>
-            </w:r>
-            <w:r>
-              <w:rPr>
-                <w:b/>
-                <w:bCs/>
-              </w:rPr>
-              <w:t xml:space="preserve">acceptent</w:t>
-            </w:r>
-            <w:r>
-              <w:t xml:space="preserve"> en partie → pas vécu comme une contrainte → </w:t>
-            </w:r>
-            <w:r>
-              <w:rPr>
-                <w:b/>
-                <w:bCs/>
-              </w:rPr>
-              <w:t xml:space="preserve">plus puissant</w:t>
-            </w:r>
-            <w:r>
-              <w:t xml:space="preserve"> que le pouvoir</w:t>
-            </w:r>
-          </w:p>
-          <w:p>
-            <w:pPr>
-              <w:pStyle w:val="ListParagraph"/>
-              <w:numPr>
-                <w:ilvl w:val="0"/>
-                <w:numId w:val="2"/>
-              </w:numPr>
-              <w:spacing w:after="30"/>
-            </w:pPr>
-            <w:r>
-              <w:rPr>
-                <w:b/>
-                <w:bCs/>
-                <w:shd w:fill="F7CFCF" w:color="auto" w:val="clear"/>
-              </w:rPr>
-              <w:t xml:space="preserve">Leçon : l'institution = espace de DOMINATION</w:t>
-            </w:r>
-            <w:r>
-              <w:t xml:space="preserve"> (elle fabrique, diffuse, entretient ces rapports)</w:t>
+              <w:t xml:space="preserve">Socialisation</w:t>
+            </w:r>
+            <w:r>
+              <w:t xml:space="preserve"> = l'ensemble des processus par lesquels l'individu </w:t>
+            </w:r>
+            <w:r>
+              <w:rPr>
+                <w:b/>
+                <w:bCs/>
+              </w:rPr>
+              <w:t xml:space="preserve">acquiert les normes, valeurs, croyances…</w:t>
+            </w:r>
+            <w:r>
+              <w:t xml:space="preserve"> de la société et des </w:t>
+            </w:r>
+            <w:r>
+              <w:rPr>
+                <w:b/>
+                <w:bCs/>
+              </w:rPr>
+              <w:t xml:space="preserve">groupes plus restreints</w:t>
+            </w:r>
+            <w:r>
+              <w:t xml:space="preserve"> auxquels il appartient</w:t>
+            </w:r>
+          </w:p>
+          <w:p>
+            <w:pPr>
+              <w:pStyle w:val="ListParagraph"/>
+              <w:numPr>
+                <w:ilvl w:val="0"/>
+                <w:numId w:val="2"/>
+              </w:numPr>
+              <w:spacing w:after="30"/>
+            </w:pPr>
+            <w:r>
+              <w:t xml:space="preserve">« Être moral, c'est être social »</w:t>
             </w:r>
           </w:p>
         </w:tc>
@@ -2456,7 +2824,7 @@
                 <w:sz w:val="18"/>
                 <w:szCs w:val="18"/>
               </w:rPr>
-              <w:t xml:space="preserve">Texte 4</w:t>
+              <w:t xml:space="preserve">Texte 2</w:t>
             </w:r>
           </w:p>
           <w:p>
@@ -2470,7 +2838,7 @@
                 <w:sz w:val="18"/>
                 <w:szCs w:val="18"/>
               </w:rPr>
-              <w:t xml:space="preserve">Hughes</w:t>
+              <w:t xml:space="preserve">Durkheim</w:t>
             </w:r>
           </w:p>
           <w:p>
@@ -2489,7 +2857,7 @@
                 <w:sz w:val="18"/>
                 <w:szCs w:val="18"/>
               </w:rPr>
-              <w:t xml:space="preserve">« Les institutions</w:t>
+              <w:t xml:space="preserve">L'évolution</w:t>
             </w:r>
           </w:p>
           <w:p>
@@ -2503,7 +2871,7 @@
                 <w:sz w:val="18"/>
                 <w:szCs w:val="18"/>
               </w:rPr>
-              <w:t xml:space="preserve">américaines</w:t>
+              <w:t xml:space="preserve">pédagogique</w:t>
             </w:r>
           </w:p>
           <w:p>
@@ -2517,12 +2885,259 @@
                 <w:sz w:val="18"/>
                 <w:szCs w:val="18"/>
               </w:rPr>
-              <w:t xml:space="preserve">comme entreprises</w:t>
-            </w:r>
-          </w:p>
-          <w:p>
-            <w:pPr>
-              <w:jc w:val="center"/>
+              <w:t xml:space="preserve">en France</w:t>
+            </w:r>
+          </w:p>
+        </w:tc>
+        <w:tc>
+          <w:tcPr>
+            <w:tcW w:type="dxa" w:w="8366"/>
+            <w:tcBorders>
+              <w:top w:val="single" w:color="8C8C8C" w:sz="6"/>
+              <w:left w:val="single" w:color="8C8C8C" w:sz="6"/>
+              <w:bottom w:val="single" w:color="8C8C8C" w:sz="6"/>
+              <w:right w:val="single" w:color="8C8C8C" w:sz="6"/>
+            </w:tcBorders>
+            <w:tcMar>
+              <w:top w:type="dxa" w:w="50"/>
+              <w:left w:type="dxa" w:w="90"/>
+              <w:bottom w:type="dxa" w:w="50"/>
+              <w:right w:type="dxa" w:w="90"/>
+            </w:tcMar>
+            <w:vAlign w:val="center"/>
+          </w:tcPr>
+          <w:p>
+            <w:pPr>
+              <w:pStyle w:val="ListParagraph"/>
+              <w:numPr>
+                <w:ilvl w:val="0"/>
+                <w:numId w:val="2"/>
+              </w:numPr>
+              <w:spacing w:after="30"/>
+            </w:pPr>
+            <w:r>
+              <w:t xml:space="preserve">Durkheim cherche l'origine de l'institution scolaire dans </w:t>
+            </w:r>
+            <w:r>
+              <w:rPr>
+                <w:b/>
+                <w:bCs/>
+              </w:rPr>
+              <w:t xml:space="preserve">une autre institution</w:t>
+            </w:r>
+            <w:r>
+              <w:t xml:space="preserve"> : l'</w:t>
+            </w:r>
+            <w:r>
+              <w:rPr>
+                <w:b/>
+                <w:bCs/>
+              </w:rPr>
+              <w:t xml:space="preserve">école chrétienne du Moyen Âge</w:t>
+            </w:r>
+            <w:r>
+              <w:t xml:space="preserve"> = l'</w:t>
+            </w:r>
+            <w:r>
+              <w:rPr>
+                <w:b/>
+                <w:bCs/>
+              </w:rPr>
+              <w:t xml:space="preserve">embryon</w:t>
+            </w:r>
+            <w:r>
+              <w:t xml:space="preserve"> de l'école</w:t>
+            </w:r>
+          </w:p>
+          <w:p>
+            <w:pPr>
+              <w:pStyle w:val="ListParagraph"/>
+              <w:numPr>
+                <w:ilvl w:val="0"/>
+                <w:numId w:val="2"/>
+              </w:numPr>
+              <w:spacing w:after="30"/>
+            </w:pPr>
+            <w:r>
+              <w:rPr>
+                <w:b/>
+                <w:bCs/>
+              </w:rPr>
+              <w:t xml:space="preserve">École de l'Antiquité</w:t>
+            </w:r>
+            <w:r>
+              <w:t xml:space="preserve"> : maîtres séparés, enseignements sans lien → transmet des </w:t>
+            </w:r>
+            <w:r>
+              <w:rPr>
+                <w:b/>
+                <w:bCs/>
+              </w:rPr>
+              <w:t xml:space="preserve">savoirs/talents</w:t>
+            </w:r>
+            <w:r>
+              <w:t xml:space="preserve">, ne travaille pas l'individu en profondeur → </w:t>
+            </w:r>
+            <w:r>
+              <w:rPr>
+                <w:b/>
+                <w:bCs/>
+              </w:rPr>
+              <w:t xml:space="preserve">pas vraiment une institution</w:t>
+            </w:r>
+          </w:p>
+          <w:p>
+            <w:pPr>
+              <w:pStyle w:val="ListParagraph"/>
+              <w:numPr>
+                <w:ilvl w:val="0"/>
+                <w:numId w:val="2"/>
+              </w:numPr>
+              <w:spacing w:after="30"/>
+            </w:pPr>
+            <w:r>
+              <w:rPr>
+                <w:b/>
+                <w:bCs/>
+              </w:rPr>
+              <w:t xml:space="preserve">École chrétienne</w:t>
+            </w:r>
+            <w:r>
+              <w:t xml:space="preserve"> : un seul </w:t>
+            </w:r>
+            <w:r>
+              <w:rPr>
+                <w:b/>
+                <w:bCs/>
+              </w:rPr>
+              <w:t xml:space="preserve">milieu moral</w:t>
+            </w:r>
+            <w:r>
+              <w:t xml:space="preserve"> qui enveloppe l'enfant (internat), une seule influence → vise une </w:t>
+            </w:r>
+            <w:r>
+              <w:rPr>
+                <w:b/>
+                <w:bCs/>
+              </w:rPr>
+              <w:t xml:space="preserve">conversion</w:t>
+            </w:r>
+            <w:r>
+              <w:t xml:space="preserve">, un « état profond » de l'âme</w:t>
+            </w:r>
+          </w:p>
+          <w:p>
+            <w:pPr>
+              <w:pStyle w:val="ListParagraph"/>
+              <w:numPr>
+                <w:ilvl w:val="1"/>
+                <w:numId w:val="2"/>
+              </w:numPr>
+              <w:spacing w:after="30"/>
+            </w:pPr>
+            <w:r>
+              <w:t xml:space="preserve">→ à l'origine de l'</w:t>
+            </w:r>
+            <w:r>
+              <w:rPr>
+                <w:b/>
+                <w:bCs/>
+              </w:rPr>
+              <w:t xml:space="preserve">institution scolaire</w:t>
+            </w:r>
+            <w:r>
+              <w:t xml:space="preserve"> actuelle (but sécularisé : « en faire un homme »)</w:t>
+            </w:r>
+          </w:p>
+          <w:p>
+            <w:pPr>
+              <w:pStyle w:val="ListParagraph"/>
+              <w:numPr>
+                <w:ilvl w:val="0"/>
+                <w:numId w:val="2"/>
+              </w:numPr>
+              <w:spacing w:after="30"/>
+            </w:pPr>
+            <w:r>
+              <w:t xml:space="preserve">Les institutions créent des </w:t>
+            </w:r>
+            <w:r>
+              <w:rPr>
+                <w:b/>
+                <w:bCs/>
+                <w:shd w:fill="E4D9F0" w:color="auto" w:val="clear"/>
+              </w:rPr>
+              <w:t xml:space="preserve">dispositions profondes</w:t>
+            </w:r>
+            <w:r>
+              <w:t xml:space="preserve"> : </w:t>
+            </w:r>
+            <w:r>
+              <w:rPr>
+                <w:b/>
+                <w:bCs/>
+                <w:shd w:fill="FCEFB4" w:color="auto" w:val="clear"/>
+              </w:rPr>
+              <w:t xml:space="preserve">manières durables et profondément intériorisées de penser et d'agir</w:t>
+            </w:r>
+          </w:p>
+          <w:p>
+            <w:pPr>
+              <w:pStyle w:val="ListParagraph"/>
+              <w:numPr>
+                <w:ilvl w:val="1"/>
+                <w:numId w:val="2"/>
+              </w:numPr>
+              <w:spacing w:after="30"/>
+            </w:pPr>
+            <w:r>
+              <w:t xml:space="preserve">→ on agit </w:t>
+            </w:r>
+            <w:r>
+              <w:rPr>
+                <w:b/>
+                <w:bCs/>
+              </w:rPr>
+              <w:t xml:space="preserve">sans y penser</w:t>
+            </w:r>
+            <w:r>
+              <w:t xml:space="preserve">, comme on respire (= naturalisation)</w:t>
+            </w:r>
+          </w:p>
+          <w:p>
+            <w:pPr>
+              <w:pStyle w:val="ListParagraph"/>
+              <w:numPr>
+                <w:ilvl w:val="0"/>
+                <w:numId w:val="2"/>
+              </w:numPr>
+              <w:spacing w:after="30"/>
+            </w:pPr>
+            <w:r>
+              <w:rPr>
+                <w:b/>
+                <w:bCs/>
+                <w:shd w:fill="F7CFCF" w:color="auto" w:val="clear"/>
+              </w:rPr>
+              <w:t xml:space="preserve">Leçon : l'institution = espace de SOCIALISATION</w:t>
+            </w:r>
+            <w:r>
+              <w:t xml:space="preserve"> ; elle est </w:t>
+            </w:r>
+            <w:r>
+              <w:rPr>
+                <w:b/>
+                <w:bCs/>
+              </w:rPr>
+              <w:t xml:space="preserve">vivante</w:t>
+            </w:r>
+            <w:r>
+              <w:t xml:space="preserve">, elle se transforme</w:t>
+            </w:r>
+          </w:p>
+          <w:p>
+            <w:pPr>
+              <w:spacing w:before="60" w:after="40"/>
             </w:pPr>
             <w:r>
               <w:rPr>
@@ -2531,6 +3146,1450 @@
                 <w:sz w:val="18"/>
                 <w:szCs w:val="18"/>
               </w:rPr>
+              <w:t xml:space="preserve">Tableau comparatif (TD 18/09)</w:t>
+            </w:r>
+          </w:p>
+          <w:tbl>
+            <w:tblPr>
+              <w:tblW w:type="dxa" w:w="8100"/>
+              <w:tblLayout w:type="fixed"/>
+            </w:tblPr>
+            <w:tblGrid>
+              <w:gridCol w:w="1900"/>
+              <w:gridCol w:w="3100"/>
+              <w:gridCol w:w="3100"/>
+            </w:tblGrid>
+            <w:tr>
+              <w:trPr>
+                <w:cantSplit/>
+              </w:trPr>
+              <w:tc>
+                <w:tcPr>
+                  <w:tcW w:type="dxa" w:w="1900"/>
+                  <w:tcBorders>
+                    <w:top w:val="single" w:color="8C8C8C" w:sz="6"/>
+                    <w:left w:val="single" w:color="8C8C8C" w:sz="6"/>
+                    <w:bottom w:val="single" w:color="8C8C8C" w:sz="6"/>
+                    <w:right w:val="single" w:color="8C8C8C" w:sz="6"/>
+                  </w:tcBorders>
+                  <w:shd w:fill="DCEAF7" w:color="auto" w:val="clear"/>
+                  <w:tcMar>
+                    <w:top w:type="dxa" w:w="50"/>
+                    <w:left w:type="dxa" w:w="90"/>
+                    <w:bottom w:type="dxa" w:w="50"/>
+                    <w:right w:type="dxa" w:w="90"/>
+                  </w:tcMar>
+                  <w:vAlign w:val="center"/>
+                </w:tcPr>
+                <w:p>
+                  <w:pPr>
+                    <w:spacing w:after="0"/>
+                  </w:pPr>
+                </w:p>
+              </w:tc>
+              <w:tc>
+                <w:tcPr>
+                  <w:tcW w:type="dxa" w:w="3100"/>
+                  <w:tcBorders>
+                    <w:top w:val="single" w:color="8C8C8C" w:sz="6"/>
+                    <w:left w:val="single" w:color="8C8C8C" w:sz="6"/>
+                    <w:bottom w:val="single" w:color="8C8C8C" w:sz="6"/>
+                    <w:right w:val="single" w:color="8C8C8C" w:sz="6"/>
+                  </w:tcBorders>
+                  <w:shd w:fill="DCEAF7" w:color="auto" w:val="clear"/>
+                  <w:tcMar>
+                    <w:top w:type="dxa" w:w="50"/>
+                    <w:left w:type="dxa" w:w="90"/>
+                    <w:bottom w:type="dxa" w:w="50"/>
+                    <w:right w:type="dxa" w:w="90"/>
+                  </w:tcMar>
+                  <w:vAlign w:val="center"/>
+                </w:tcPr>
+                <w:p>
+                  <w:pPr>
+                    <w:spacing w:after="0"/>
+                  </w:pPr>
+                  <w:r>
+                    <w:rPr>
+                      <w:b/>
+                      <w:bCs/>
+                      <w:sz w:val="17"/>
+                      <w:szCs w:val="17"/>
+                    </w:rPr>
+                    <w:t xml:space="preserve">Enseignement de l'Antiquité</w:t>
+                  </w:r>
+                </w:p>
+              </w:tc>
+              <w:tc>
+                <w:tcPr>
+                  <w:tcW w:type="dxa" w:w="3100"/>
+                  <w:tcBorders>
+                    <w:top w:val="single" w:color="8C8C8C" w:sz="6"/>
+                    <w:left w:val="single" w:color="8C8C8C" w:sz="6"/>
+                    <w:bottom w:val="single" w:color="8C8C8C" w:sz="6"/>
+                    <w:right w:val="single" w:color="8C8C8C" w:sz="6"/>
+                  </w:tcBorders>
+                  <w:shd w:fill="DCEAF7" w:color="auto" w:val="clear"/>
+                  <w:tcMar>
+                    <w:top w:type="dxa" w:w="50"/>
+                    <w:left w:type="dxa" w:w="90"/>
+                    <w:bottom w:type="dxa" w:w="50"/>
+                    <w:right w:type="dxa" w:w="90"/>
+                  </w:tcMar>
+                  <w:vAlign w:val="center"/>
+                </w:tcPr>
+                <w:p>
+                  <w:pPr>
+                    <w:spacing w:after="0"/>
+                  </w:pPr>
+                  <w:r>
+                    <w:rPr>
+                      <w:b/>
+                      <w:bCs/>
+                      <w:sz w:val="17"/>
+                      <w:szCs w:val="17"/>
+                    </w:rPr>
+                    <w:t xml:space="preserve">École chrétienne</w:t>
+                  </w:r>
+                </w:p>
+              </w:tc>
+            </w:tr>
+            <w:tr>
+              <w:trPr>
+                <w:cantSplit/>
+              </w:trPr>
+              <w:tc>
+                <w:tcPr>
+                  <w:tcW w:type="dxa" w:w="1900"/>
+                  <w:tcBorders>
+                    <w:top w:val="single" w:color="8C8C8C" w:sz="6"/>
+                    <w:left w:val="single" w:color="8C8C8C" w:sz="6"/>
+                    <w:bottom w:val="single" w:color="8C8C8C" w:sz="6"/>
+                    <w:right w:val="single" w:color="8C8C8C" w:sz="6"/>
+                  </w:tcBorders>
+                  <w:shd w:fill="ECE4F5" w:color="auto" w:val="clear"/>
+                  <w:tcMar>
+                    <w:top w:type="dxa" w:w="50"/>
+                    <w:left w:type="dxa" w:w="90"/>
+                    <w:bottom w:type="dxa" w:w="50"/>
+                    <w:right w:type="dxa" w:w="90"/>
+                  </w:tcMar>
+                  <w:vAlign w:val="center"/>
+                </w:tcPr>
+                <w:p>
+                  <w:pPr>
+                    <w:spacing w:after="0"/>
+                  </w:pPr>
+                  <w:r>
+                    <w:rPr>
+                      <w:b/>
+                      <w:bCs/>
+                      <w:sz w:val="17"/>
+                      <w:szCs w:val="17"/>
+                    </w:rPr>
+                    <w:t xml:space="preserve">Organisation</w:t>
+                  </w:r>
+                </w:p>
+              </w:tc>
+              <w:tc>
+                <w:tcPr>
+                  <w:tcW w:type="dxa" w:w="3100"/>
+                  <w:tcBorders>
+                    <w:top w:val="single" w:color="8C8C8C" w:sz="6"/>
+                    <w:left w:val="single" w:color="8C8C8C" w:sz="6"/>
+                    <w:bottom w:val="single" w:color="8C8C8C" w:sz="6"/>
+                    <w:right w:val="single" w:color="8C8C8C" w:sz="6"/>
+                  </w:tcBorders>
+                  <w:tcMar>
+                    <w:top w:type="dxa" w:w="50"/>
+                    <w:left w:type="dxa" w:w="90"/>
+                    <w:bottom w:type="dxa" w:w="50"/>
+                    <w:right w:type="dxa" w:w="90"/>
+                  </w:tcMar>
+                  <w:vAlign w:val="center"/>
+                </w:tcPr>
+                <w:p>
+                  <w:pPr>
+                    <w:spacing w:after="0"/>
+                  </w:pPr>
+                  <w:r>
+                    <w:rPr>
+                      <w:sz w:val="17"/>
+                      <w:szCs w:val="17"/>
+                    </w:rPr>
+                    <w:t xml:space="preserve">Reçoit l'instruction de </w:t>
+                  </w:r>
+                  <w:r>
+                    <w:rPr>
+                      <w:b/>
+                      <w:bCs/>
+                      <w:sz w:val="17"/>
+                      <w:szCs w:val="17"/>
+                    </w:rPr>
+                    <w:t xml:space="preserve">maîtres différents</w:t>
+                  </w:r>
+                  <w:r>
+                    <w:rPr>
+                      <w:sz w:val="17"/>
+                      <w:szCs w:val="17"/>
+                    </w:rPr>
+                    <w:t xml:space="preserve"> → </w:t>
+                  </w:r>
+                  <w:r>
+                    <w:rPr>
+                      <w:b/>
+                      <w:bCs/>
+                      <w:sz w:val="17"/>
+                      <w:szCs w:val="17"/>
+                    </w:rPr>
+                    <w:t xml:space="preserve">dispersé</w:t>
+                  </w:r>
+                </w:p>
+              </w:tc>
+              <w:tc>
+                <w:tcPr>
+                  <w:tcW w:type="dxa" w:w="3100"/>
+                  <w:tcBorders>
+                    <w:top w:val="single" w:color="8C8C8C" w:sz="6"/>
+                    <w:left w:val="single" w:color="8C8C8C" w:sz="6"/>
+                    <w:bottom w:val="single" w:color="8C8C8C" w:sz="6"/>
+                    <w:right w:val="single" w:color="8C8C8C" w:sz="6"/>
+                  </w:tcBorders>
+                  <w:tcMar>
+                    <w:top w:type="dxa" w:w="50"/>
+                    <w:left w:type="dxa" w:w="90"/>
+                    <w:bottom w:type="dxa" w:w="50"/>
+                    <w:right w:type="dxa" w:w="90"/>
+                  </w:tcMar>
+                  <w:vAlign w:val="center"/>
+                </w:tcPr>
+                <w:p>
+                  <w:pPr>
+                    <w:spacing w:after="0"/>
+                  </w:pPr>
+                  <w:r>
+                    <w:rPr>
+                      <w:sz w:val="17"/>
+                      <w:szCs w:val="17"/>
+                    </w:rPr>
+                    <w:t xml:space="preserve">Apparaît au Moyen Âge, </w:t>
+                  </w:r>
+                  <w:r>
+                    <w:rPr>
+                      <w:b/>
+                      <w:bCs/>
+                      <w:sz w:val="17"/>
+                      <w:szCs w:val="17"/>
+                    </w:rPr>
+                    <w:t xml:space="preserve">internat</w:t>
+                  </w:r>
+                  <w:r>
+                    <w:rPr>
+                      <w:sz w:val="17"/>
+                      <w:szCs w:val="17"/>
+                    </w:rPr>
+                    <w:t xml:space="preserve">, un seul enseignant → </w:t>
+                  </w:r>
+                  <w:r>
+                    <w:rPr>
+                      <w:b/>
+                      <w:bCs/>
+                      <w:sz w:val="17"/>
+                      <w:szCs w:val="17"/>
+                    </w:rPr>
+                    <w:t xml:space="preserve">concentré</w:t>
+                  </w:r>
+                </w:p>
+              </w:tc>
+            </w:tr>
+            <w:tr>
+              <w:trPr>
+                <w:cantSplit/>
+              </w:trPr>
+              <w:tc>
+                <w:tcPr>
+                  <w:tcW w:type="dxa" w:w="1900"/>
+                  <w:tcBorders>
+                    <w:top w:val="single" w:color="8C8C8C" w:sz="6"/>
+                    <w:left w:val="single" w:color="8C8C8C" w:sz="6"/>
+                    <w:bottom w:val="single" w:color="8C8C8C" w:sz="6"/>
+                    <w:right w:val="single" w:color="8C8C8C" w:sz="6"/>
+                  </w:tcBorders>
+                  <w:shd w:fill="ECE4F5" w:color="auto" w:val="clear"/>
+                  <w:tcMar>
+                    <w:top w:type="dxa" w:w="50"/>
+                    <w:left w:type="dxa" w:w="90"/>
+                    <w:bottom w:type="dxa" w:w="50"/>
+                    <w:right w:type="dxa" w:w="90"/>
+                  </w:tcMar>
+                  <w:vAlign w:val="center"/>
+                </w:tcPr>
+                <w:p>
+                  <w:pPr>
+                    <w:spacing w:after="0"/>
+                  </w:pPr>
+                  <w:r>
+                    <w:rPr>
+                      <w:b/>
+                      <w:bCs/>
+                      <w:sz w:val="17"/>
+                      <w:szCs w:val="17"/>
+                    </w:rPr>
+                    <w:t xml:space="preserve">Objectif de la formation</w:t>
+                  </w:r>
+                </w:p>
+              </w:tc>
+              <w:tc>
+                <w:tcPr>
+                  <w:tcW w:type="dxa" w:w="3100"/>
+                  <w:tcBorders>
+                    <w:top w:val="single" w:color="8C8C8C" w:sz="6"/>
+                    <w:left w:val="single" w:color="8C8C8C" w:sz="6"/>
+                    <w:bottom w:val="single" w:color="8C8C8C" w:sz="6"/>
+                    <w:right w:val="single" w:color="8C8C8C" w:sz="6"/>
+                  </w:tcBorders>
+                  <w:tcMar>
+                    <w:top w:type="dxa" w:w="50"/>
+                    <w:left w:type="dxa" w:w="90"/>
+                    <w:bottom w:type="dxa" w:w="50"/>
+                    <w:right w:type="dxa" w:w="90"/>
+                  </w:tcMar>
+                  <w:vAlign w:val="center"/>
+                </w:tcPr>
+                <w:p>
+                  <w:pPr>
+                    <w:spacing w:after="0"/>
+                  </w:pPr>
+                  <w:r>
+                    <w:rPr>
+                      <w:b/>
+                      <w:bCs/>
+                      <w:sz w:val="17"/>
+                      <w:szCs w:val="17"/>
+                    </w:rPr>
+                    <w:t xml:space="preserve">Communiquer des savoirs</w:t>
+                  </w:r>
+                  <w:r>
+                    <w:rPr>
+                      <w:sz w:val="17"/>
+                      <w:szCs w:val="17"/>
+                    </w:rPr>
+                    <w:t xml:space="preserve">, instruire</w:t>
+                  </w:r>
+                </w:p>
+              </w:tc>
+              <w:tc>
+                <w:tcPr>
+                  <w:tcW w:type="dxa" w:w="3100"/>
+                  <w:tcBorders>
+                    <w:top w:val="single" w:color="8C8C8C" w:sz="6"/>
+                    <w:left w:val="single" w:color="8C8C8C" w:sz="6"/>
+                    <w:bottom w:val="single" w:color="8C8C8C" w:sz="6"/>
+                    <w:right w:val="single" w:color="8C8C8C" w:sz="6"/>
+                  </w:tcBorders>
+                  <w:tcMar>
+                    <w:top w:type="dxa" w:w="50"/>
+                    <w:left w:type="dxa" w:w="90"/>
+                    <w:bottom w:type="dxa" w:w="50"/>
+                    <w:right w:type="dxa" w:w="90"/>
+                  </w:tcMar>
+                  <w:vAlign w:val="center"/>
+                </w:tcPr>
+                <w:p>
+                  <w:pPr>
+                    <w:spacing w:after="0"/>
+                  </w:pPr>
+                  <w:r>
+                    <w:rPr>
+                      <w:b/>
+                      <w:bCs/>
+                      <w:sz w:val="17"/>
+                      <w:szCs w:val="17"/>
+                    </w:rPr>
+                    <w:t xml:space="preserve">Former le chrétien</w:t>
+                  </w:r>
+                  <w:r>
+                    <w:rPr>
+                      <w:sz w:val="17"/>
+                      <w:szCs w:val="17"/>
+                    </w:rPr>
+                    <w:t xml:space="preserve"> : on étudie, mange, dort… on </w:t>
+                  </w:r>
+                  <w:r>
+                    <w:rPr>
+                      <w:b/>
+                      <w:bCs/>
+                      <w:sz w:val="17"/>
+                      <w:szCs w:val="17"/>
+                    </w:rPr>
+                    <w:t xml:space="preserve">vit</w:t>
+                  </w:r>
+                  <w:r>
+                    <w:rPr>
+                      <w:sz w:val="17"/>
+                      <w:szCs w:val="17"/>
+                    </w:rPr>
+                    <w:t xml:space="preserve"> à l'école</w:t>
+                  </w:r>
+                </w:p>
+              </w:tc>
+            </w:tr>
+            <w:tr>
+              <w:trPr>
+                <w:cantSplit/>
+              </w:trPr>
+              <w:tc>
+                <w:tcPr>
+                  <w:tcW w:type="dxa" w:w="1900"/>
+                  <w:tcBorders>
+                    <w:top w:val="single" w:color="8C8C8C" w:sz="6"/>
+                    <w:left w:val="single" w:color="8C8C8C" w:sz="6"/>
+                    <w:bottom w:val="single" w:color="8C8C8C" w:sz="6"/>
+                    <w:right w:val="single" w:color="8C8C8C" w:sz="6"/>
+                  </w:tcBorders>
+                  <w:shd w:fill="ECE4F5" w:color="auto" w:val="clear"/>
+                  <w:tcMar>
+                    <w:top w:type="dxa" w:w="50"/>
+                    <w:left w:type="dxa" w:w="90"/>
+                    <w:bottom w:type="dxa" w:w="50"/>
+                    <w:right w:type="dxa" w:w="90"/>
+                  </w:tcMar>
+                  <w:vAlign w:val="center"/>
+                </w:tcPr>
+                <w:p>
+                  <w:pPr>
+                    <w:spacing w:after="0"/>
+                  </w:pPr>
+                  <w:r>
+                    <w:rPr>
+                      <w:b/>
+                      <w:bCs/>
+                      <w:sz w:val="17"/>
+                      <w:szCs w:val="17"/>
+                    </w:rPr>
+                    <w:t xml:space="preserve">Relation élèves / institution</w:t>
+                  </w:r>
+                </w:p>
+              </w:tc>
+              <w:tc>
+                <w:tcPr>
+                  <w:tcW w:type="dxa" w:w="3100"/>
+                  <w:tcBorders>
+                    <w:top w:val="single" w:color="8C8C8C" w:sz="6"/>
+                    <w:left w:val="single" w:color="8C8C8C" w:sz="6"/>
+                    <w:bottom w:val="single" w:color="8C8C8C" w:sz="6"/>
+                    <w:right w:val="single" w:color="8C8C8C" w:sz="6"/>
+                  </w:tcBorders>
+                  <w:tcMar>
+                    <w:top w:type="dxa" w:w="50"/>
+                    <w:left w:type="dxa" w:w="90"/>
+                    <w:bottom w:type="dxa" w:w="50"/>
+                    <w:right w:type="dxa" w:w="90"/>
+                  </w:tcMar>
+                  <w:vAlign w:val="center"/>
+                </w:tcPr>
+                <w:p>
+                  <w:pPr>
+                    <w:spacing w:after="0"/>
+                  </w:pPr>
+                  <w:r>
+                    <w:rPr>
+                      <w:b/>
+                      <w:bCs/>
+                      <w:sz w:val="17"/>
+                      <w:szCs w:val="17"/>
+                    </w:rPr>
+                    <w:t xml:space="preserve">Épisodique</w:t>
+                  </w:r>
+                  <w:r>
+                    <w:rPr>
+                      <w:sz w:val="17"/>
+                      <w:szCs w:val="17"/>
+                    </w:rPr>
+                    <w:t xml:space="preserve">, superficielle</w:t>
+                  </w:r>
+                </w:p>
+              </w:tc>
+              <w:tc>
+                <w:tcPr>
+                  <w:tcW w:type="dxa" w:w="3100"/>
+                  <w:tcBorders>
+                    <w:top w:val="single" w:color="8C8C8C" w:sz="6"/>
+                    <w:left w:val="single" w:color="8C8C8C" w:sz="6"/>
+                    <w:bottom w:val="single" w:color="8C8C8C" w:sz="6"/>
+                    <w:right w:val="single" w:color="8C8C8C" w:sz="6"/>
+                  </w:tcBorders>
+                  <w:tcMar>
+                    <w:top w:type="dxa" w:w="50"/>
+                    <w:left w:type="dxa" w:w="90"/>
+                    <w:bottom w:type="dxa" w:w="50"/>
+                    <w:right w:type="dxa" w:w="90"/>
+                  </w:tcMar>
+                  <w:vAlign w:val="center"/>
+                </w:tcPr>
+                <w:p>
+                  <w:pPr>
+                    <w:spacing w:after="0"/>
+                  </w:pPr>
+                  <w:r>
+                    <w:rPr>
+                      <w:b/>
+                      <w:bCs/>
+                      <w:sz w:val="17"/>
+                      <w:szCs w:val="17"/>
+                    </w:rPr>
+                    <w:t xml:space="preserve">Permanente</w:t>
+                  </w:r>
+                  <w:r>
+                    <w:rPr>
+                      <w:sz w:val="17"/>
+                      <w:szCs w:val="17"/>
+                    </w:rPr>
+                    <w:t xml:space="preserve"> et </w:t>
+                  </w:r>
+                  <w:r>
+                    <w:rPr>
+                      <w:b/>
+                      <w:bCs/>
+                      <w:sz w:val="17"/>
+                      <w:szCs w:val="17"/>
+                    </w:rPr>
+                    <w:t xml:space="preserve">intense</w:t>
+                  </w:r>
+                </w:p>
+              </w:tc>
+            </w:tr>
+            <w:tr>
+              <w:trPr>
+                <w:cantSplit/>
+              </w:trPr>
+              <w:tc>
+                <w:tcPr>
+                  <w:tcW w:type="dxa" w:w="1900"/>
+                  <w:tcBorders>
+                    <w:top w:val="single" w:color="8C8C8C" w:sz="6"/>
+                    <w:left w:val="single" w:color="8C8C8C" w:sz="6"/>
+                    <w:bottom w:val="single" w:color="8C8C8C" w:sz="6"/>
+                    <w:right w:val="single" w:color="8C8C8C" w:sz="6"/>
+                  </w:tcBorders>
+                  <w:shd w:fill="ECE4F5" w:color="auto" w:val="clear"/>
+                  <w:tcMar>
+                    <w:top w:type="dxa" w:w="50"/>
+                    <w:left w:type="dxa" w:w="90"/>
+                    <w:bottom w:type="dxa" w:w="50"/>
+                    <w:right w:type="dxa" w:w="90"/>
+                  </w:tcMar>
+                  <w:vAlign w:val="center"/>
+                </w:tcPr>
+                <w:p>
+                  <w:pPr>
+                    <w:spacing w:after="0"/>
+                  </w:pPr>
+                  <w:r>
+                    <w:rPr>
+                      <w:b/>
+                      <w:bCs/>
+                      <w:sz w:val="17"/>
+                      <w:szCs w:val="17"/>
+                    </w:rPr>
+                    <w:t xml:space="preserve">Effets sur l'individu</w:t>
+                  </w:r>
+                </w:p>
+              </w:tc>
+              <w:tc>
+                <w:tcPr>
+                  <w:tcW w:type="dxa" w:w="3100"/>
+                  <w:tcBorders>
+                    <w:top w:val="single" w:color="8C8C8C" w:sz="6"/>
+                    <w:left w:val="single" w:color="8C8C8C" w:sz="6"/>
+                    <w:bottom w:val="single" w:color="8C8C8C" w:sz="6"/>
+                    <w:right w:val="single" w:color="8C8C8C" w:sz="6"/>
+                  </w:tcBorders>
+                  <w:tcMar>
+                    <w:top w:type="dxa" w:w="50"/>
+                    <w:left w:type="dxa" w:w="90"/>
+                    <w:bottom w:type="dxa" w:w="50"/>
+                    <w:right w:type="dxa" w:w="90"/>
+                  </w:tcMar>
+                  <w:vAlign w:val="center"/>
+                </w:tcPr>
+                <w:p>
+                  <w:pPr>
+                    <w:spacing w:after="0"/>
+                  </w:pPr>
+                  <w:r>
+                    <w:rPr>
+                      <w:sz w:val="17"/>
+                      <w:szCs w:val="17"/>
+                    </w:rPr>
+                    <w:t xml:space="preserve">Ça ne touche pas trop l'individu</w:t>
+                  </w:r>
+                </w:p>
+              </w:tc>
+              <w:tc>
+                <w:tcPr>
+                  <w:tcW w:type="dxa" w:w="3100"/>
+                  <w:tcBorders>
+                    <w:top w:val="single" w:color="8C8C8C" w:sz="6"/>
+                    <w:left w:val="single" w:color="8C8C8C" w:sz="6"/>
+                    <w:bottom w:val="single" w:color="8C8C8C" w:sz="6"/>
+                    <w:right w:val="single" w:color="8C8C8C" w:sz="6"/>
+                  </w:tcBorders>
+                  <w:tcMar>
+                    <w:top w:type="dxa" w:w="50"/>
+                    <w:left w:type="dxa" w:w="90"/>
+                    <w:bottom w:type="dxa" w:w="50"/>
+                    <w:right w:type="dxa" w:w="90"/>
+                  </w:tcMar>
+                  <w:vAlign w:val="center"/>
+                </w:tcPr>
+                <w:p>
+                  <w:pPr>
+                    <w:spacing w:after="0"/>
+                  </w:pPr>
+                  <w:r>
+                    <w:rPr>
+                      <w:sz w:val="17"/>
+                      <w:szCs w:val="17"/>
+                    </w:rPr>
+                    <w:t xml:space="preserve">Va dans un seul sens : </w:t>
+                  </w:r>
+                  <w:r>
+                    <w:rPr>
+                      <w:b/>
+                      <w:bCs/>
+                      <w:sz w:val="17"/>
+                      <w:szCs w:val="17"/>
+                    </w:rPr>
+                    <w:t xml:space="preserve">effets profonds</w:t>
+                  </w:r>
+                  <w:r>
+                    <w:rPr>
+                      <w:sz w:val="17"/>
+                      <w:szCs w:val="17"/>
+                    </w:rPr>
+                    <w:t xml:space="preserve">, influence unique</w:t>
+                  </w:r>
+                </w:p>
+              </w:tc>
+            </w:tr>
+            <w:tr>
+              <w:trPr>
+                <w:cantSplit/>
+              </w:trPr>
+              <w:tc>
+                <w:tcPr>
+                  <w:tcW w:type="dxa" w:w="1900"/>
+                  <w:tcBorders>
+                    <w:top w:val="single" w:color="8C8C8C" w:sz="6"/>
+                    <w:left w:val="single" w:color="8C8C8C" w:sz="6"/>
+                    <w:bottom w:val="single" w:color="8C8C8C" w:sz="6"/>
+                    <w:right w:val="single" w:color="8C8C8C" w:sz="6"/>
+                  </w:tcBorders>
+                  <w:shd w:fill="ECE4F5" w:color="auto" w:val="clear"/>
+                  <w:tcMar>
+                    <w:top w:type="dxa" w:w="50"/>
+                    <w:left w:type="dxa" w:w="90"/>
+                    <w:bottom w:type="dxa" w:w="50"/>
+                    <w:right w:type="dxa" w:w="90"/>
+                  </w:tcMar>
+                  <w:vAlign w:val="center"/>
+                </w:tcPr>
+                <w:p>
+                  <w:pPr>
+                    <w:spacing w:after="0"/>
+                  </w:pPr>
+                  <w:r>
+                    <w:rPr>
+                      <w:b/>
+                      <w:bCs/>
+                      <w:sz w:val="17"/>
+                      <w:szCs w:val="17"/>
+                    </w:rPr>
+                    <w:t xml:space="preserve">Image</w:t>
+                  </w:r>
+                </w:p>
+              </w:tc>
+              <w:tc>
+                <w:tcPr>
+                  <w:tcW w:type="dxa" w:w="3100"/>
+                  <w:tcBorders>
+                    <w:top w:val="single" w:color="8C8C8C" w:sz="6"/>
+                    <w:left w:val="single" w:color="8C8C8C" w:sz="6"/>
+                    <w:bottom w:val="single" w:color="8C8C8C" w:sz="6"/>
+                    <w:right w:val="single" w:color="8C8C8C" w:sz="6"/>
+                  </w:tcBorders>
+                  <w:tcMar>
+                    <w:top w:type="dxa" w:w="50"/>
+                    <w:left w:type="dxa" w:w="90"/>
+                    <w:bottom w:type="dxa" w:w="50"/>
+                    <w:right w:type="dxa" w:w="90"/>
+                  </w:tcMar>
+                  <w:vAlign w:val="center"/>
+                </w:tcPr>
+                <w:p>
+                  <w:pPr>
+                    <w:spacing w:after="0"/>
+                  </w:pPr>
+                  <w:r>
+                    <w:rPr>
+                      <w:sz w:val="17"/>
+                      <w:szCs w:val="17"/>
+                    </w:rPr>
+                    <w:t xml:space="preserve">Comme une auto-école</w:t>
+                  </w:r>
+                </w:p>
+              </w:tc>
+              <w:tc>
+                <w:tcPr>
+                  <w:tcW w:type="dxa" w:w="3100"/>
+                  <w:tcBorders>
+                    <w:top w:val="single" w:color="8C8C8C" w:sz="6"/>
+                    <w:left w:val="single" w:color="8C8C8C" w:sz="6"/>
+                    <w:bottom w:val="single" w:color="8C8C8C" w:sz="6"/>
+                    <w:right w:val="single" w:color="8C8C8C" w:sz="6"/>
+                  </w:tcBorders>
+                  <w:tcMar>
+                    <w:top w:type="dxa" w:w="50"/>
+                    <w:left w:type="dxa" w:w="90"/>
+                    <w:bottom w:type="dxa" w:w="50"/>
+                    <w:right w:type="dxa" w:w="90"/>
+                  </w:tcMar>
+                  <w:vAlign w:val="center"/>
+                </w:tcPr>
+                <w:p>
+                  <w:pPr>
+                    <w:spacing w:after="0"/>
+                  </w:pPr>
+                  <w:r>
+                    <w:rPr>
+                      <w:sz w:val="17"/>
+                      <w:szCs w:val="17"/>
+                    </w:rPr>
+                    <w:t xml:space="preserve">Parallèle avec la société : </w:t>
+                  </w:r>
+                  <w:r>
+                    <w:rPr>
+                      <w:b/>
+                      <w:bCs/>
+                      <w:sz w:val="17"/>
+                      <w:szCs w:val="17"/>
+                    </w:rPr>
+                    <w:t xml:space="preserve">image de la société</w:t>
+                  </w:r>
+                  <w:r>
+                    <w:rPr>
+                      <w:sz w:val="17"/>
+                      <w:szCs w:val="17"/>
+                    </w:rPr>
+                    <w:t xml:space="preserve">, unie</w:t>
+                  </w:r>
+                </w:p>
+              </w:tc>
+            </w:tr>
+            <w:tr>
+              <w:trPr>
+                <w:cantSplit/>
+              </w:trPr>
+              <w:tc>
+                <w:tcPr>
+                  <w:tcW w:type="dxa" w:w="1900"/>
+                  <w:tcBorders>
+                    <w:top w:val="single" w:color="8C8C8C" w:sz="6"/>
+                    <w:left w:val="single" w:color="8C8C8C" w:sz="6"/>
+                    <w:bottom w:val="single" w:color="8C8C8C" w:sz="6"/>
+                    <w:right w:val="single" w:color="8C8C8C" w:sz="6"/>
+                  </w:tcBorders>
+                  <w:shd w:fill="ECE4F5" w:color="auto" w:val="clear"/>
+                  <w:tcMar>
+                    <w:top w:type="dxa" w:w="50"/>
+                    <w:left w:type="dxa" w:w="90"/>
+                    <w:bottom w:type="dxa" w:w="50"/>
+                    <w:right w:type="dxa" w:w="90"/>
+                  </w:tcMar>
+                  <w:vAlign w:val="center"/>
+                </w:tcPr>
+                <w:p>
+                  <w:pPr>
+                    <w:spacing w:after="0"/>
+                  </w:pPr>
+                  <w:r>
+                    <w:rPr>
+                      <w:b/>
+                      <w:bCs/>
+                      <w:sz w:val="17"/>
+                      <w:szCs w:val="17"/>
+                    </w:rPr>
+                    <w:t xml:space="preserve">Conclusion</w:t>
+                  </w:r>
+                </w:p>
+              </w:tc>
+              <w:tc>
+                <w:tcPr>
+                  <w:tcW w:type="dxa" w:w="3100"/>
+                  <w:tcBorders>
+                    <w:top w:val="single" w:color="8C8C8C" w:sz="6"/>
+                    <w:left w:val="single" w:color="8C8C8C" w:sz="6"/>
+                    <w:bottom w:val="single" w:color="8C8C8C" w:sz="6"/>
+                    <w:right w:val="single" w:color="8C8C8C" w:sz="6"/>
+                  </w:tcBorders>
+                  <w:tcMar>
+                    <w:top w:type="dxa" w:w="50"/>
+                    <w:left w:type="dxa" w:w="90"/>
+                    <w:bottom w:type="dxa" w:w="50"/>
+                    <w:right w:type="dxa" w:w="90"/>
+                  </w:tcMar>
+                  <w:vAlign w:val="center"/>
+                </w:tcPr>
+                <w:p>
+                  <w:pPr>
+                    <w:spacing w:after="0"/>
+                  </w:pPr>
+                  <w:r>
+                    <w:rPr>
+                      <w:b/>
+                      <w:bCs/>
+                      <w:sz w:val="17"/>
+                      <w:szCs w:val="17"/>
+                      <w:shd w:fill="F7CFCF" w:color="auto" w:val="clear"/>
+                    </w:rPr>
+                    <w:t xml:space="preserve">Pas une institution</w:t>
+                  </w:r>
+                  <w:r>
+                    <w:rPr>
+                      <w:sz w:val="17"/>
+                      <w:szCs w:val="17"/>
+                    </w:rPr>
+                    <w:t xml:space="preserve"> pour Durkheim</w:t>
+                  </w:r>
+                </w:p>
+              </w:tc>
+              <w:tc>
+                <w:tcPr>
+                  <w:tcW w:type="dxa" w:w="3100"/>
+                  <w:tcBorders>
+                    <w:top w:val="single" w:color="8C8C8C" w:sz="6"/>
+                    <w:left w:val="single" w:color="8C8C8C" w:sz="6"/>
+                    <w:bottom w:val="single" w:color="8C8C8C" w:sz="6"/>
+                    <w:right w:val="single" w:color="8C8C8C" w:sz="6"/>
+                  </w:tcBorders>
+                  <w:tcMar>
+                    <w:top w:type="dxa" w:w="50"/>
+                    <w:left w:type="dxa" w:w="90"/>
+                    <w:bottom w:type="dxa" w:w="50"/>
+                    <w:right w:type="dxa" w:w="90"/>
+                  </w:tcMar>
+                  <w:vAlign w:val="center"/>
+                </w:tcPr>
+                <w:p>
+                  <w:pPr>
+                    <w:spacing w:after="0"/>
+                  </w:pPr>
+                  <w:r>
+                    <w:rPr>
+                      <w:b/>
+                      <w:bCs/>
+                      <w:sz w:val="17"/>
+                      <w:szCs w:val="17"/>
+                      <w:shd w:fill="F7CFCF" w:color="auto" w:val="clear"/>
+                    </w:rPr>
+                    <w:t xml:space="preserve">Une institution</w:t>
+                  </w:r>
+                  <w:r>
+                    <w:rPr>
+                      <w:sz w:val="17"/>
+                      <w:szCs w:val="17"/>
+                    </w:rPr>
+                    <w:t xml:space="preserve"> pour Durkheim</w:t>
+                  </w:r>
+                </w:p>
+              </w:tc>
+            </w:tr>
+          </w:tbl>
+          <w:p>
+            <w:pPr>
+              <w:spacing w:after="30"/>
+            </w:pPr>
+          </w:p>
+        </w:tc>
+      </w:tr>
+      <w:tr>
+        <w:trPr>
+          <w:cantSplit/>
+        </w:trPr>
+        <w:tc>
+          <w:tcPr>
+            <w:tcW w:type="dxa" w:w="2100"/>
+            <w:tcBorders>
+              <w:top w:val="single" w:color="8C8C8C" w:sz="6"/>
+              <w:left w:val="single" w:color="8C8C8C" w:sz="6"/>
+              <w:bottom w:val="single" w:color="8C8C8C" w:sz="6"/>
+              <w:right w:val="single" w:color="8C8C8C" w:sz="6"/>
+            </w:tcBorders>
+            <w:shd w:fill="DCEAF7" w:color="auto" w:val="clear"/>
+            <w:tcMar>
+              <w:top w:type="dxa" w:w="50"/>
+              <w:left w:type="dxa" w:w="90"/>
+              <w:bottom w:type="dxa" w:w="50"/>
+              <w:right w:type="dxa" w:w="90"/>
+            </w:tcMar>
+            <w:vAlign w:val="center"/>
+          </w:tcPr>
+          <w:p>
+            <w:pPr>
+              <w:jc w:val="center"/>
+            </w:pPr>
+            <w:r>
+              <w:rPr>
+                <w:b/>
+                <w:bCs/>
+                <w:sz w:val="18"/>
+                <w:szCs w:val="18"/>
+              </w:rPr>
+              <w:t xml:space="preserve">Texte 3</w:t>
+            </w:r>
+          </w:p>
+          <w:p>
+            <w:pPr>
+              <w:jc w:val="center"/>
+            </w:pPr>
+            <w:r>
+              <w:rPr>
+                <w:b/>
+                <w:bCs/>
+                <w:sz w:val="18"/>
+                <w:szCs w:val="18"/>
+              </w:rPr>
+              <w:t xml:space="preserve">Weber</w:t>
+            </w:r>
+          </w:p>
+          <w:p>
+            <w:pPr>
+              <w:jc w:val="center"/>
+            </w:pPr>
+          </w:p>
+          <w:p>
+            <w:pPr>
+              <w:jc w:val="center"/>
+            </w:pPr>
+            <w:r>
+              <w:rPr>
+                <w:b/>
+                <w:bCs/>
+                <w:sz w:val="18"/>
+                <w:szCs w:val="18"/>
+              </w:rPr>
+              <w:t xml:space="preserve">Le savant</w:t>
+            </w:r>
+          </w:p>
+          <w:p>
+            <w:pPr>
+              <w:jc w:val="center"/>
+            </w:pPr>
+            <w:r>
+              <w:rPr>
+                <w:b/>
+                <w:bCs/>
+                <w:sz w:val="18"/>
+                <w:szCs w:val="18"/>
+              </w:rPr>
+              <w:t xml:space="preserve">et le politique</w:t>
+            </w:r>
+          </w:p>
+        </w:tc>
+        <w:tc>
+          <w:tcPr>
+            <w:tcW w:type="dxa" w:w="8366"/>
+            <w:tcBorders>
+              <w:top w:val="single" w:color="8C8C8C" w:sz="6"/>
+              <w:left w:val="single" w:color="8C8C8C" w:sz="6"/>
+              <w:bottom w:val="single" w:color="8C8C8C" w:sz="6"/>
+              <w:right w:val="single" w:color="8C8C8C" w:sz="6"/>
+            </w:tcBorders>
+            <w:tcMar>
+              <w:top w:type="dxa" w:w="50"/>
+              <w:left w:type="dxa" w:w="90"/>
+              <w:bottom w:type="dxa" w:w="50"/>
+              <w:right w:type="dxa" w:w="90"/>
+            </w:tcMar>
+            <w:vAlign w:val="center"/>
+          </w:tcPr>
+          <w:p>
+            <w:pPr>
+              <w:pStyle w:val="ListParagraph"/>
+              <w:numPr>
+                <w:ilvl w:val="0"/>
+                <w:numId w:val="2"/>
+              </w:numPr>
+              <w:spacing w:after="30"/>
+            </w:pPr>
+            <w:r>
+              <w:rPr>
+                <w:b/>
+                <w:bCs/>
+                <w:shd w:fill="D4EBCB" w:color="auto" w:val="clear"/>
+              </w:rPr>
+              <w:t xml:space="preserve">Max Weber</w:t>
+            </w:r>
+            <w:r>
+              <w:t xml:space="preserve"> (allemand) prend l'exemple de l'</w:t>
+            </w:r>
+            <w:r>
+              <w:rPr>
+                <w:b/>
+                <w:bCs/>
+              </w:rPr>
+              <w:t xml:space="preserve">État</w:t>
+            </w:r>
+          </w:p>
+          <w:p>
+            <w:pPr>
+              <w:pStyle w:val="ListParagraph"/>
+              <w:numPr>
+                <w:ilvl w:val="0"/>
+                <w:numId w:val="2"/>
+              </w:numPr>
+              <w:spacing w:after="30"/>
+            </w:pPr>
+            <w:r>
+              <w:t xml:space="preserve">Il ne prend pas les institutions comme objet : il fait une </w:t>
+            </w:r>
+            <w:r>
+              <w:rPr>
+                <w:b/>
+                <w:bCs/>
+                <w:shd w:fill="E4D9F0" w:color="auto" w:val="clear"/>
+              </w:rPr>
+              <w:t xml:space="preserve">sociologie compréhensive</w:t>
+            </w:r>
+            <w:r>
+              <w:t xml:space="preserve"> = aider les personnes à </w:t>
+            </w:r>
+            <w:r>
+              <w:rPr>
+                <w:b/>
+                <w:bCs/>
+              </w:rPr>
+              <w:t xml:space="preserve">mieux saisir la logique de ce qu'elles font</w:t>
+            </w:r>
+          </w:p>
+          <w:p>
+            <w:pPr>
+              <w:pStyle w:val="ListParagraph"/>
+              <w:numPr>
+                <w:ilvl w:val="0"/>
+                <w:numId w:val="2"/>
+              </w:numPr>
+              <w:spacing w:after="30"/>
+            </w:pPr>
+            <w:r>
+              <w:t xml:space="preserve">Le livre vient de </w:t>
+            </w:r>
+            <w:r>
+              <w:rPr>
+                <w:b/>
+                <w:bCs/>
+              </w:rPr>
+              <w:t xml:space="preserve">2 conférences</w:t>
+            </w:r>
+            <w:r>
+              <w:t xml:space="preserve"> ; phrase célèbre : « on peut vivre </w:t>
+            </w:r>
+            <w:r>
+              <w:rPr>
+                <w:b/>
+                <w:bCs/>
+              </w:rPr>
+              <w:t xml:space="preserve">pour</w:t>
+            </w:r>
+            <w:r>
+              <w:t xml:space="preserve"> et </w:t>
+            </w:r>
+            <w:r>
+              <w:rPr>
+                <w:b/>
+                <w:bCs/>
+              </w:rPr>
+              <w:t xml:space="preserve">de</w:t>
+            </w:r>
+            <w:r>
+              <w:t xml:space="preserve"> la politique »</w:t>
+            </w:r>
+          </w:p>
+          <w:p>
+            <w:pPr>
+              <w:pStyle w:val="ListParagraph"/>
+              <w:numPr>
+                <w:ilvl w:val="0"/>
+                <w:numId w:val="2"/>
+              </w:numPr>
+              <w:spacing w:after="30"/>
+            </w:pPr>
+            <w:r>
+              <w:t xml:space="preserve">Il définit d'abord l'État </w:t>
+            </w:r>
+            <w:r>
+              <w:rPr>
+                <w:b/>
+                <w:bCs/>
+              </w:rPr>
+              <w:t xml:space="preserve">par la négation</w:t>
+            </w:r>
+            <w:r>
+              <w:t xml:space="preserve"> : on le retrouve dans trop de domaines, le définir par son contenu donnerait une liste vaine → on le définit par ses </w:t>
+            </w:r>
+            <w:r>
+              <w:rPr>
+                <w:b/>
+                <w:bCs/>
+              </w:rPr>
+              <w:t xml:space="preserve">moyens</w:t>
+            </w:r>
+          </w:p>
+          <w:p>
+            <w:pPr>
+              <w:pStyle w:val="ListParagraph"/>
+              <w:numPr>
+                <w:ilvl w:val="0"/>
+                <w:numId w:val="2"/>
+              </w:numPr>
+              <w:spacing w:after="30"/>
+            </w:pPr>
+            <w:r>
+              <w:t xml:space="preserve">On ne définit pas l'État par </w:t>
+            </w:r>
+            <w:r>
+              <w:rPr>
+                <w:b/>
+                <w:bCs/>
+              </w:rPr>
+              <w:t xml:space="preserve">ce qu'il fait</w:t>
+            </w:r>
+            <w:r>
+              <w:t xml:space="preserve">, mais par son </w:t>
+            </w:r>
+            <w:r>
+              <w:rPr>
+                <w:b/>
+                <w:bCs/>
+              </w:rPr>
+              <w:t xml:space="preserve">moyen spécifique</w:t>
+            </w:r>
+            <w:r>
+              <w:t xml:space="preserve"> : </w:t>
+            </w:r>
+            <w:r>
+              <w:rPr>
+                <w:b/>
+                <w:bCs/>
+                <w:shd w:fill="FCEFB4" w:color="auto" w:val="clear"/>
+              </w:rPr>
+              <w:t xml:space="preserve">le monopole de la violence physique légitime</w:t>
+            </w:r>
+            <w:r>
+              <w:t xml:space="preserve"> (sur un territoire)</w:t>
+            </w:r>
+          </w:p>
+          <w:p>
+            <w:pPr>
+              <w:pStyle w:val="ListParagraph"/>
+              <w:numPr>
+                <w:ilvl w:val="0"/>
+                <w:numId w:val="2"/>
+              </w:numPr>
+              <w:spacing w:after="30"/>
+            </w:pPr>
+            <w:r>
+              <w:t xml:space="preserve">L'État = rapport de </w:t>
+            </w:r>
+            <w:r>
+              <w:rPr>
+                <w:b/>
+                <w:bCs/>
+              </w:rPr>
+              <w:t xml:space="preserve">domination</w:t>
+            </w:r>
+            <w:r>
+              <w:t xml:space="preserve"> fondé sur la violence </w:t>
+            </w:r>
+            <w:r>
+              <w:rPr>
+                <w:b/>
+                <w:bCs/>
+              </w:rPr>
+              <w:t xml:space="preserve">légitime</w:t>
+            </w:r>
+            <w:r>
+              <w:t xml:space="preserve"> → les dominés se soumettent à l'autorité revendiquée</w:t>
+            </w:r>
+          </w:p>
+          <w:p>
+            <w:pPr>
+              <w:pStyle w:val="ListParagraph"/>
+              <w:numPr>
+                <w:ilvl w:val="0"/>
+                <w:numId w:val="2"/>
+              </w:numPr>
+              <w:spacing w:after="30"/>
+            </w:pPr>
+            <w:r>
+              <w:t xml:space="preserve">Leçons : une institution se définit par ① ses </w:t>
+            </w:r>
+            <w:r>
+              <w:rPr>
+                <w:b/>
+                <w:bCs/>
+              </w:rPr>
+              <w:t xml:space="preserve">moyens d'agir</w:t>
+            </w:r>
+            <w:r>
+              <w:t xml:space="preserve"> ② la </w:t>
+            </w:r>
+            <w:r>
+              <w:rPr>
+                <w:b/>
+                <w:bCs/>
+              </w:rPr>
+              <w:t xml:space="preserve">justification / légitimation</w:t>
+            </w:r>
+            <w:r>
+              <w:t xml:space="preserve"> de ses actions</w:t>
+            </w:r>
+          </w:p>
+          <w:p>
+            <w:pPr>
+              <w:pStyle w:val="ListParagraph"/>
+              <w:numPr>
+                <w:ilvl w:val="0"/>
+                <w:numId w:val="2"/>
+              </w:numPr>
+              <w:spacing w:after="30"/>
+            </w:pPr>
+            <w:r>
+              <w:rPr>
+                <w:b/>
+                <w:bCs/>
+                <w:shd w:fill="E4D9F0" w:color="auto" w:val="clear"/>
+              </w:rPr>
+              <w:t xml:space="preserve">Pouvoir</w:t>
+            </w:r>
+            <w:r>
+              <w:t xml:space="preserve"> : capacité à imposer quelque chose à quelqu'un (quels que soient les moyens)</w:t>
+            </w:r>
+          </w:p>
+          <w:p>
+            <w:pPr>
+              <w:pStyle w:val="ListParagraph"/>
+              <w:numPr>
+                <w:ilvl w:val="0"/>
+                <w:numId w:val="2"/>
+              </w:numPr>
+              <w:spacing w:after="30"/>
+            </w:pPr>
+            <w:r>
+              <w:rPr>
+                <w:b/>
+                <w:bCs/>
+                <w:shd w:fill="FCEFB4" w:color="auto" w:val="clear"/>
+              </w:rPr>
+              <w:t xml:space="preserve">Légitimité</w:t>
+            </w:r>
+            <w:r>
+              <w:t xml:space="preserve"> = croyance dans le </w:t>
+            </w:r>
+            <w:r>
+              <w:rPr>
+                <w:b/>
+                <w:bCs/>
+              </w:rPr>
+              <w:t xml:space="preserve">bien-fondé</w:t>
+            </w:r>
+            <w:r>
+              <w:t xml:space="preserve"> du pouvoir</w:t>
+            </w:r>
+          </w:p>
+          <w:p>
+            <w:pPr>
+              <w:pStyle w:val="ListParagraph"/>
+              <w:numPr>
+                <w:ilvl w:val="0"/>
+                <w:numId w:val="2"/>
+              </w:numPr>
+              <w:spacing w:after="30"/>
+            </w:pPr>
+            <w:r>
+              <w:rPr>
+                <w:b/>
+                <w:bCs/>
+                <w:shd w:fill="E4D9F0" w:color="auto" w:val="clear"/>
+              </w:rPr>
+              <w:t xml:space="preserve">Domination</w:t>
+            </w:r>
+            <w:r>
+              <w:t xml:space="preserve"> : rapport de pouvoir </w:t>
+            </w:r>
+            <w:r>
+              <w:rPr>
+                <w:b/>
+                <w:bCs/>
+              </w:rPr>
+              <w:t xml:space="preserve">légitimé</w:t>
+            </w:r>
+            <w:r>
+              <w:t xml:space="preserve">, que les dominés </w:t>
+            </w:r>
+            <w:r>
+              <w:rPr>
+                <w:b/>
+                <w:bCs/>
+              </w:rPr>
+              <w:t xml:space="preserve">acceptent</w:t>
+            </w:r>
+            <w:r>
+              <w:t xml:space="preserve"> en partie → pas vécu comme une contrainte → </w:t>
+            </w:r>
+            <w:r>
+              <w:rPr>
+                <w:b/>
+                <w:bCs/>
+              </w:rPr>
+              <w:t xml:space="preserve">plus puissant</w:t>
+            </w:r>
+            <w:r>
+              <w:t xml:space="preserve"> que le pouvoir</w:t>
+            </w:r>
+          </w:p>
+          <w:p>
+            <w:pPr>
+              <w:pStyle w:val="ListParagraph"/>
+              <w:numPr>
+                <w:ilvl w:val="0"/>
+                <w:numId w:val="2"/>
+              </w:numPr>
+              <w:spacing w:after="30"/>
+            </w:pPr>
+            <w:r>
+              <w:rPr>
+                <w:b/>
+                <w:bCs/>
+                <w:shd w:fill="F7CFCF" w:color="auto" w:val="clear"/>
+              </w:rPr>
+              <w:t xml:space="preserve">Leçon : l'institution = espace de DOMINATION</w:t>
+            </w:r>
+            <w:r>
+              <w:t xml:space="preserve"> (elle fabrique, diffuse, entretient ces rapports)</w:t>
+            </w:r>
+          </w:p>
+        </w:tc>
+      </w:tr>
+      <w:tr>
+        <w:trPr>
+          <w:cantSplit/>
+        </w:trPr>
+        <w:tc>
+          <w:tcPr>
+            <w:tcW w:type="dxa" w:w="2100"/>
+            <w:tcBorders>
+              <w:top w:val="single" w:color="8C8C8C" w:sz="6"/>
+              <w:left w:val="single" w:color="8C8C8C" w:sz="6"/>
+              <w:bottom w:val="single" w:color="8C8C8C" w:sz="6"/>
+              <w:right w:val="single" w:color="8C8C8C" w:sz="6"/>
+            </w:tcBorders>
+            <w:shd w:fill="DCEAF7" w:color="auto" w:val="clear"/>
+            <w:tcMar>
+              <w:top w:type="dxa" w:w="50"/>
+              <w:left w:type="dxa" w:w="90"/>
+              <w:bottom w:type="dxa" w:w="50"/>
+              <w:right w:type="dxa" w:w="90"/>
+            </w:tcMar>
+            <w:vAlign w:val="center"/>
+          </w:tcPr>
+          <w:p>
+            <w:pPr>
+              <w:jc w:val="center"/>
+            </w:pPr>
+            <w:r>
+              <w:rPr>
+                <w:b/>
+                <w:bCs/>
+                <w:sz w:val="18"/>
+                <w:szCs w:val="18"/>
+              </w:rPr>
+              <w:t xml:space="preserve">Texte 4</w:t>
+            </w:r>
+          </w:p>
+          <w:p>
+            <w:pPr>
+              <w:jc w:val="center"/>
+            </w:pPr>
+            <w:r>
+              <w:rPr>
+                <w:b/>
+                <w:bCs/>
+                <w:sz w:val="18"/>
+                <w:szCs w:val="18"/>
+              </w:rPr>
+              <w:t xml:space="preserve">Hughes</w:t>
+            </w:r>
+          </w:p>
+          <w:p>
+            <w:pPr>
+              <w:jc w:val="center"/>
+            </w:pPr>
+          </w:p>
+          <w:p>
+            <w:pPr>
+              <w:jc w:val="center"/>
+            </w:pPr>
+            <w:r>
+              <w:rPr>
+                <w:b/>
+                <w:bCs/>
+                <w:sz w:val="18"/>
+                <w:szCs w:val="18"/>
+              </w:rPr>
+              <w:t xml:space="preserve">« Les institutions</w:t>
+            </w:r>
+          </w:p>
+          <w:p>
+            <w:pPr>
+              <w:jc w:val="center"/>
+            </w:pPr>
+            <w:r>
+              <w:rPr>
+                <w:b/>
+                <w:bCs/>
+                <w:sz w:val="18"/>
+                <w:szCs w:val="18"/>
+              </w:rPr>
+              <w:t xml:space="preserve">américaines</w:t>
+            </w:r>
+          </w:p>
+          <w:p>
+            <w:pPr>
+              <w:jc w:val="center"/>
+            </w:pPr>
+            <w:r>
+              <w:rPr>
+                <w:b/>
+                <w:bCs/>
+                <w:sz w:val="18"/>
+                <w:szCs w:val="18"/>
+              </w:rPr>
+              <w:t xml:space="preserve">comme entreprises</w:t>
+            </w:r>
+          </w:p>
+          <w:p>
+            <w:pPr>
+              <w:jc w:val="center"/>
+            </w:pPr>
+            <w:r>
+              <w:rPr>
+                <w:b/>
+                <w:bCs/>
+                <w:sz w:val="18"/>
+                <w:szCs w:val="18"/>
+              </w:rPr>
               <w:t xml:space="preserve">collectives »</w:t>
             </w:r>
           </w:p>
@@ -2604,6 +4663,67 @@
               <w:spacing w:after="30"/>
             </w:pPr>
             <w:r>
+              <w:t xml:space="preserve">2 générations : </w:t>
+            </w:r>
+            <w:r>
+              <w:rPr>
+                <w:b/>
+                <w:bCs/>
+              </w:rPr>
+              <w:t xml:space="preserve">avant la 2ᵈᵉ GM</w:t>
+            </w:r>
+            <w:r>
+              <w:t xml:space="preserve"> (R. Park, E. Burgess : pauvreté, délinquance) ; </w:t>
+            </w:r>
+            <w:r>
+              <w:rPr>
+                <w:b/>
+                <w:bCs/>
+              </w:rPr>
+              <w:t xml:space="preserve">après</w:t>
+            </w:r>
+            <w:r>
+              <w:t xml:space="preserve"> (art, déviance, apprentissage du métier de médecin ; E. Goffman)</w:t>
+            </w:r>
+          </w:p>
+          <w:p>
+            <w:pPr>
+              <w:pStyle w:val="ListParagraph"/>
+              <w:numPr>
+                <w:ilvl w:val="0"/>
+                <w:numId w:val="2"/>
+              </w:numPr>
+              <w:spacing w:after="30"/>
+            </w:pPr>
+            <w:r>
+              <w:rPr>
+                <w:b/>
+                <w:bCs/>
+                <w:shd w:fill="F7CFCF" w:color="auto" w:val="clear"/>
+              </w:rPr>
+              <w:t xml:space="preserve">Critique principale</w:t>
+            </w:r>
+            <w:r>
+              <w:t xml:space="preserve"> : les recherches sur les institutions </w:t>
+            </w:r>
+            <w:r>
+              <w:rPr>
+                <w:b/>
+                <w:bCs/>
+              </w:rPr>
+              <w:t xml:space="preserve">ne s'intéressent pas à leur environnement</w:t>
+            </w:r>
+          </w:p>
+          <w:p>
+            <w:pPr>
+              <w:pStyle w:val="ListParagraph"/>
+              <w:numPr>
+                <w:ilvl w:val="0"/>
+                <w:numId w:val="2"/>
+              </w:numPr>
+              <w:spacing w:after="30"/>
+            </w:pPr>
+            <w:r>
               <w:t xml:space="preserve">Institution vue comme une </w:t>
             </w:r>
             <w:r>
@@ -2737,6 +4857,29 @@
                 <w:bCs/>
               </w:rPr>
               <w:t xml:space="preserve">symboliques</w:t>
+            </w:r>
+          </w:p>
+          <w:p>
+            <w:pPr>
+              <w:pStyle w:val="ListParagraph"/>
+              <w:numPr>
+                <w:ilvl w:val="0"/>
+                <w:numId w:val="2"/>
+              </w:numPr>
+              <w:spacing w:after="30"/>
+            </w:pPr>
+            <w:r>
+              <w:t xml:space="preserve">Elles peuvent choisir leur environnement, mais </w:t>
+            </w:r>
+            <w:r>
+              <w:rPr>
+                <w:b/>
+                <w:bCs/>
+              </w:rPr>
+              <w:t xml:space="preserve">pas totalement librement</w:t>
+            </w:r>
+            <w:r>
+              <w:t xml:space="preserve"> : il y a des contraintes</w:t>
             </w:r>
           </w:p>
           <w:p>
@@ -4174,6 +6317,29 @@
             </w:tcMar>
             <w:vAlign w:val="center"/>
           </w:tcPr>
+          <w:p>
+            <w:pPr>
+              <w:pStyle w:val="ListParagraph"/>
+              <w:numPr>
+                <w:ilvl w:val="0"/>
+                <w:numId w:val="2"/>
+              </w:numPr>
+              <w:spacing w:after="30"/>
+            </w:pPr>
+            <w:r>
+              <w:t xml:space="preserve">Charlatans = tous ceux qui </w:t>
+            </w:r>
+            <w:r>
+              <w:rPr>
+                <w:b/>
+                <w:bCs/>
+              </w:rPr>
+              <w:t xml:space="preserve">ne sont pas diplômés</w:t>
+            </w:r>
+            <w:r>
+              <w:t xml:space="preserve"> (médecins ou autres professions)</w:t>
+            </w:r>
+          </w:p>
           <w:p>
             <w:pPr>
               <w:pStyle w:val="ListParagraph"/>

</xml_diff>